<commit_message>
Report rewritten in first-person engineering voice; same results and structure
Co-Authored-By: Claude Opus 5.5 <noreply@anthropic.com>
</commit_message>
<xml_diff>
--- a/docs/REPORT.docx
+++ b/docs/REPORT.docx
@@ -49,7 +49,7 @@
         <w:pStyle w:val="BlockText"/>
       </w:pPr>
       <w:r>
-        <w:t xml:space="preserve">Every number in this report is copied from</w:t>
+        <w:t xml:space="preserve">Every number below comes from</w:t>
       </w:r>
       <w:r>
         <w:t xml:space="preserve"> </w:t>
@@ -64,7 +64,7 @@
         <w:t xml:space="preserve"> </w:t>
       </w:r>
       <w:r>
-        <w:t xml:space="preserve">(generated by</w:t>
+        <w:t xml:space="preserve">(written by</w:t>
       </w:r>
       <w:r>
         <w:t xml:space="preserve"> </w:t>
@@ -100,7 +100,7 @@
         <w:t xml:space="preserve">scripts/07_operating_points.py</w:t>
       </w:r>
       <w:r>
-        <w:t xml:space="preserve">). Real-data models were trained on an RTX 4070 laptop GPU (Intel Core, 20 logical CPUs, Windows 11); the synthetic run used a 2-core cloud Xeon.</w:t>
+        <w:t xml:space="preserve">); nothing was typed in by hand. The real-data models were trained on my laptop (RTX 4070 laptop GPU, Intel Core with 20 logical CPUs, Windows 11); the synthetic run used a 2-core cloud Xeon.</w:t>
       </w:r>
       <w:r>
         <w:t xml:space="preserve"> </w:t>
@@ -115,7 +115,7 @@
         <w:t xml:space="preserve"> </w:t>
       </w:r>
       <w:r>
-        <w:t xml:space="preserve">= leakage-aware split,</w:t>
+        <w:t xml:space="preserve">is the leakage-aware split and</w:t>
       </w:r>
       <w:r>
         <w:t xml:space="preserve"> </w:t>
@@ -130,7 +130,7 @@
         <w:t xml:space="preserve"> </w:t>
       </w:r>
       <w:r>
-        <w:t xml:space="preserve">= predefined split (Section 2.2).</w:t>
+        <w:t xml:space="preserve">the predefined one (Section 2.2).</w:t>
       </w:r>
     </w:p>
     <w:p>
@@ -164,7 +164,7 @@
         <w:t xml:space="preserve"> </w:t>
       </w:r>
       <w:r>
-        <w:t xml:space="preserve">Sliced bacon is packed by laying several rashers in a tray and heat-sealing a lidding film onto the tray flange. Faults arise at both stages: rashers end up</w:t>
+        <w:t xml:space="preserve">Bacon is packed by laying a few rashers in a plastic tray and heat-sealing a lidding film onto the tray’s flange. Both steps go wrong. Rashers end up</w:t>
       </w:r>
       <w:r>
         <w:t xml:space="preserve"> </w:t>
@@ -180,7 +180,7 @@
         <w:t xml:space="preserve"> </w:t>
       </w:r>
       <w:r>
-        <w:t xml:space="preserve">(out of position, overhanging) or</w:t>
+        <w:t xml:space="preserve">(out of place, hanging over the edge) or</w:t>
       </w:r>
       <w:r>
         <w:t xml:space="preserve"> </w:t>
@@ -193,7 +193,7 @@
         <w:t xml:space="preserve">twisted</w:t>
       </w:r>
       <w:r>
-        <w:t xml:space="preserve">; the film is</w:t>
+        <w:t xml:space="preserve">. The film ends up</w:t>
       </w:r>
       <w:r>
         <w:t xml:space="preserve"> </w:t>
@@ -222,7 +222,7 @@
         <w:t xml:space="preserve">wrinkled</w:t>
       </w:r>
       <w:r>
-        <w:t xml:space="preserve">, or otherwise damaged (</w:t>
+        <w:t xml:space="preserve">, or damaged in some other way (</w:t>
       </w:r>
       <w:r>
         <w:rPr>
@@ -232,7 +232,7 @@
         <w:t xml:space="preserve">packaging-error</w:t>
       </w:r>
       <w:r>
-        <w:t xml:space="preserve">). An unsealed pack leaks, loses its protective atmosphere and spoils before its use-by date; an untidy pack is rejected by the retailer. Inspection is still largely manual — one person watching trays pass at around one per second — which is tiring, inconsistent and leaves no record.</w:t>
+        <w:t xml:space="preserve">). An unsealed pack leaks, loses its protective atmosphere and spoils early; a messy one gets sent back by the retailer. Most lines still check this by eye — one person watching trays go past at about one a second. That is tiring, it drifts over a shift, and it leaves no record.</w:t>
       </w:r>
     </w:p>
     <w:p>
@@ -244,13 +244,13 @@
           <w:bCs/>
           <w:b/>
         </w:rPr>
-        <w:t xml:space="preserve">Problem addressed (narrowed scope).</w:t>
-      </w:r>
-      <w:r>
-        <w:t xml:space="preserve"> </w:t>
-      </w:r>
-      <w:r>
-        <w:t xml:space="preserve">From one top-view RGB image of a sealed tray on the conveyor:</w:t>
+        <w:t xml:space="preserve">What I set out to do.</w:t>
+      </w:r>
+      <w:r>
+        <w:t xml:space="preserve"> </w:t>
+      </w:r>
+      <w:r>
+        <w:t xml:space="preserve">Given one top-view RGB photo of a sealed tray on the conveyor:</w:t>
       </w:r>
       <w:r>
         <w:t xml:space="preserve"> </w:t>
@@ -266,13 +266,13 @@
           <w:bCs/>
           <w:b/>
         </w:rPr>
-        <w:t xml:space="preserve">detect and localise</w:t>
-      </w:r>
-      <w:r>
-        <w:t xml:space="preserve"> </w:t>
-      </w:r>
-      <w:r>
-        <w:t xml:space="preserve">each defect of the five annotated types (box, class, confidence);</w:t>
+        <w:t xml:space="preserve">find and box</w:t>
+      </w:r>
+      <w:r>
+        <w:t xml:space="preserve"> </w:t>
+      </w:r>
+      <w:r>
+        <w:t xml:space="preserve">every defect of the five labelled types (box, class, confidence);</w:t>
       </w:r>
       <w:r>
         <w:t xml:space="preserve"> </w:t>
@@ -294,7 +294,7 @@
         <w:t xml:space="preserve"> </w:t>
       </w:r>
       <w:r>
-        <w:t xml:space="preserve">whether the tray should PASS, FAIL, or go to a person (REVIEW);</w:t>
+        <w:t xml:space="preserve">whether the tray passes, fails, or goes to a person (PASS / FAIL / REVIEW);</w:t>
       </w:r>
       <w:r>
         <w:t xml:space="preserve"> </w:t>
@@ -310,13 +310,13 @@
           <w:bCs/>
           <w:b/>
         </w:rPr>
-        <w:t xml:space="preserve">establish</w:t>
-      </w:r>
-      <w:r>
-        <w:t xml:space="preserve"> </w:t>
-      </w:r>
-      <w:r>
-        <w:t xml:space="preserve">whether this is accurate</w:t>
+        <w:t xml:space="preserve">find out</w:t>
+      </w:r>
+      <w:r>
+        <w:t xml:space="preserve"> </w:t>
+      </w:r>
+      <w:r>
+        <w:t xml:space="preserve">whether that is accurate</w:t>
       </w:r>
       <w:r>
         <w:t xml:space="preserve"> </w:t>
@@ -332,7 +332,7 @@
         <w:t xml:space="preserve"> </w:t>
       </w:r>
       <w:r>
-        <w:t xml:space="preserve">fast enough for in-line use, and how far the accuracy figures can be trusted.</w:t>
+        <w:t xml:space="preserve">fast enough to run on a line — and how far the accuracy numbers can actually be trusted.</w:t>
       </w:r>
     </w:p>
     <w:p>
@@ -350,7 +350,7 @@
         <w:t xml:space="preserve"> </w:t>
       </w:r>
       <w:r>
-        <w:t xml:space="preserve">Missing an unsealed pack is a food-safety and recall risk; failing a good pack costs a re-check. The method is therefore judged mainly on how many defective trays it catches at an acceptable false-reject rate, not only on a detection score.</w:t>
+        <w:t xml:space="preserve">The two mistakes don’t cost the same. Letting an unsealed pack through is a food-safety and recall problem; failing a good pack costs someone a second look. So I judge the system mainly by how many defective trays it catches for a given rate of good trays wrongly failed, not by a detection score alone.</w:t>
       </w:r>
     </w:p>
     <w:p>
@@ -368,7 +368,7 @@
         <w:t xml:space="preserve"> </w:t>
       </w:r>
       <w:r>
-        <w:t xml:space="preserve">Decision support at the end of the packing line: clearly good trays pass, clearly defective trays are diverted, uncertain ones are routed to an operator, and every tray gets a machine-readable record (</w:t>
+        <w:t xml:space="preserve">A helper at the end of the packing line, not a replacement for the operator. Clear passes go through, clear fails are diverted, the uncertain middle goes to a person, and every tray gets a machine-readable record (</w:t>
       </w:r>
       <w:r>
         <w:rPr>
@@ -377,7 +377,7 @@
         <w:t xml:space="preserve">results.json</w:t>
       </w:r>
       <w:r>
-        <w:t xml:space="preserve">) for traceability. It is not intended to replace the operator for defect types that the data cannot validate (Section 5).</w:t>
+        <w:t xml:space="preserve">). It is not meant to make calls on defect types the data can’t validate (Section 5).</w:t>
       </w:r>
     </w:p>
     <w:p>
@@ -389,13 +389,13 @@
           <w:bCs/>
           <w:b/>
         </w:rPr>
-        <w:t xml:space="preserve">Limits of the scope.</w:t>
-      </w:r>
-      <w:r>
-        <w:t xml:space="preserve"> </w:t>
-      </w:r>
-      <w:r>
-        <w:t xml:space="preserve">Only the five annotated defect types and the camera set-up of the dataset (fixed overhead camera, dark textured belt, clear trays, 720 × 540 images). No seal-strength or leak measurement (a seal that looks intact can still leak), no weight or slice-count checks, no hardware integration, and no claims about other products, tray types or lighting.</w:t>
+        <w:t xml:space="preserve">What’s out of scope.</w:t>
+      </w:r>
+      <w:r>
+        <w:t xml:space="preserve"> </w:t>
+      </w:r>
+      <w:r>
+        <w:t xml:space="preserve">Only the five labelled defects and this dataset’s camera set-up (fixed overhead camera, dark textured belt, clear trays, 720 × 540 images). No seal-strength or leak testing — a seal can look fine and still leak — no weight or slice counts, no hardware integration, and no claims about other products, trays or lighting.</w:t>
       </w:r>
     </w:p>
     <w:bookmarkEnd w:id="20"/>
@@ -687,7 +687,7 @@
               <w:jc w:val="left"/>
             </w:pPr>
             <w:r>
-              <w:t xml:space="preserve">Action on the line</w:t>
+              <w:t xml:space="preserve">What the line does with the tray</w:t>
             </w:r>
           </w:p>
         </w:tc>
@@ -737,7 +737,7 @@
               <w:jc w:val="left"/>
             </w:pPr>
             <w:r>
-              <w:t xml:space="preserve">Ranking; threshold setting</w:t>
+              <w:t xml:space="preserve">Ranking; setting thresholds</w:t>
             </w:r>
           </w:p>
         </w:tc>
@@ -882,7 +882,7 @@
           <w:bCs/>
           <w:b/>
         </w:rPr>
-        <w:t xml:space="preserve">Invalid, missing or unsupported inputs</w:t>
+        <w:t xml:space="preserve">Bad, missing or unsupported inputs</w:t>
       </w:r>
       <w:r>
         <w:t xml:space="preserve"> </w:t>
@@ -897,7 +897,7 @@
         <w:t xml:space="preserve">rasherqc.io.validate_image</w:t>
       </w:r>
       <w:r>
-        <w:t xml:space="preserve">). Missing or undecodable files, greyscale images (colour is part of the evidence), RGB images whose three channels are identical, images too small to resolve a crease (side &lt; 240 px), and grossly under- or over-exposed images (mean grey level outside 20–235, or more than 25 % of pixels clipped) are reported as</w:t>
+        <w:t xml:space="preserve">). I’d rather the system admit it can’t read an image than guess. Missing or undecodable files, greyscale images (colour is part of the evidence), RGB images whose three channels are identical, images too small to resolve a crease (side &lt; 240 px), and badly under- or over-exposed images (mean grey level outside 20–235, or more than 25 % of pixels clipped) all come back as</w:t>
       </w:r>
       <w:r>
         <w:t xml:space="preserve"> </w:t>
@@ -912,7 +912,7 @@
         <w:t xml:space="preserve"> </w:t>
       </w:r>
       <w:r>
-        <w:t xml:space="preserve">with the reason. They are never passed automatically. RGBA images are accepted with the alpha channel dropped, and a warning is recorded. When training data is loaded, unknown class ids or malformed label lines raise an explicit error rather than being skipped. The inputs and outputs of individual functions are documented in Google-style docstrings and in the generated HTML API documentation (</w:t>
+        <w:t xml:space="preserve">with the reason. None of them is ever passed automatically. RGBA images are accepted with the alpha channel dropped and a warning logged. On the training side, unknown class ids or malformed label lines raise an error instead of being quietly skipped. Function-level inputs and outputs are documented in Google-style docstrings and in the generated HTML API docs (</w:t>
       </w:r>
       <w:r>
         <w:rPr>
@@ -925,13 +925,13 @@
       </w:r>
     </w:p>
     <w:bookmarkEnd w:id="21"/>
-    <w:bookmarkStart w:id="25" w:name="X387dfea96536b573d793cdc4ed338883ce18553"/>
+    <w:bookmarkStart w:id="25" w:name="the-dataset-and-what-the-audit-turned-up"/>
     <w:p>
       <w:pPr>
         <w:pStyle w:val="Heading3"/>
       </w:pPr>
       <w:r>
-        <w:t xml:space="preserve">2.2 The provided dataset — and what the audit found</w:t>
+        <w:t xml:space="preserve">2.2 The dataset — and what the audit turned up</w:t>
       </w:r>
     </w:p>
     <w:p>
@@ -949,7 +949,7 @@
         <w:t xml:space="preserve"> </w:t>
       </w:r>
       <w:r>
-        <w:t xml:space="preserve">(Roboflow Universe, version 4, CC BY 4.0). It contains 3,549 images at 720 × 540: 3,349 training images (three exposure-augmented copies, ±10 %, of 1,085 source frames), 120 validation and 80 test images, with boxes for five classes. Before modelling,</w:t>
+        <w:t xml:space="preserve">(Roboflow Universe, version 4, CC BY 4.0): 3,549 images at 720 × 540, made of 3,349 training images (three copies of each of 1,085 source frames, with ±10 % exposure changes), 120 validation and 80 test images, and boxes for five classes. Before training anything,</w:t>
       </w:r>
       <w:r>
         <w:t xml:space="preserve"> </w:t>
@@ -979,7 +979,7 @@
         <w:t xml:space="preserve"> </w:t>
       </w:r>
       <w:r>
-        <w:t xml:space="preserve">audited it. Three findings changed the project:</w:t>
+        <w:t xml:space="preserve">audited it. Three things came out of that, and they reshaped the project.</w:t>
       </w:r>
     </w:p>
     <w:p>
@@ -1001,7 +1001,10 @@
         <w:t xml:space="preserve"> </w:t>
       </w:r>
       <w:r>
-        <w:t xml:space="preserve">File names keep the source frame number (</w:t>
+        <w:t xml:space="preserve">The file names give it away:</w:t>
+      </w:r>
+      <w:r>
+        <w:t xml:space="preserve"> </w:t>
       </w:r>
       <w:r>
         <w:rPr>
@@ -1010,7 +1013,7 @@
         <w:t xml:space="preserve">frame_with_red_&lt;n&gt;</w:t>
       </w:r>
       <w:r>
-        <w:t xml:space="preserve">). For each validation and test image the distance to the nearest training frame was computed: the median is</w:t>
+        <w:t xml:space="preserve">. Measuring each validation and test image’s distance to the nearest training frame gives a median of</w:t>
       </w:r>
       <w:r>
         <w:t xml:space="preserve"> </w:t>
@@ -1023,7 +1026,25 @@
         <w:t xml:space="preserve">2.5 frames for test and 3 for validation</w:t>
       </w:r>
       <w:r>
-        <w:t xml:space="preserve">, 57 % of test images are within 3 frames of a training image, all are within 30, and 5 % share the exact frame number (they differ only by the exposure augmentation). A test tray is therefore usually the</w:t>
+        <w:t xml:space="preserve">. 57 % of test images sit within 3 frames of a training image, all of them within 30, and 5 % share the exact frame number with a training image (they differ only by the exposure tweak). In other words, a</w:t>
+      </w:r>
+      <w:r>
+        <w:t xml:space="preserve"> </w:t>
+      </w:r>
+      <w:r>
+        <w:t xml:space="preserve">“</w:t>
+      </w:r>
+      <w:r>
+        <w:t xml:space="preserve">test</w:t>
+      </w:r>
+      <w:r>
+        <w:t xml:space="preserve">”</w:t>
+      </w:r>
+      <w:r>
+        <w:t xml:space="preserve"> </w:t>
+      </w:r>
+      <w:r>
+        <w:t xml:space="preserve">tray is usually the</w:t>
       </w:r>
       <w:r>
         <w:t xml:space="preserve"> </w:t>
@@ -1039,7 +1060,7 @@
         <w:t xml:space="preserve"> </w:t>
       </w:r>
       <w:r>
-        <w:t xml:space="preserve">seen a fraction of a second after a training image, so scores on the predefined test split will be optimistic. A perceptual-hash check confirmed 143 valid/test images that are near-duplicates of training images.</w:t>
+        <w:t xml:space="preserve">a fraction of a second after one the model trained on. A perceptual-hash check flagged 143 validation/test images as near-duplicates of training images. Scores on this split were always going to look too good.</w:t>
       </w:r>
     </w:p>
     <w:p>
@@ -1055,13 +1076,13 @@
           <w:bCs/>
           <w:b/>
         </w:rPr>
-        <w:t xml:space="preserve">Classes are heavily imbalanced.</w:t>
-      </w:r>
-      <w:r>
-        <w:t xml:space="preserve"> </w:t>
-      </w:r>
-      <w:r>
-        <w:t xml:space="preserve">In training there are 1,712</w:t>
+        <w:t xml:space="preserve">The classes are badly imbalanced.</w:t>
+      </w:r>
+      <w:r>
+        <w:t xml:space="preserve"> </w:t>
+      </w:r>
+      <w:r>
+        <w:t xml:space="preserve">Training has 1,712</w:t>
       </w:r>
       <w:r>
         <w:t xml:space="preserve"> </w:t>
@@ -1127,7 +1148,7 @@
         <w:t xml:space="preserve"> </w:t>
       </w:r>
       <w:r>
-        <w:t xml:space="preserve">boxes (all three augmented copies counted). The validation and test splits contain no</w:t>
+        <w:t xml:space="preserve">boxes (counting all three copies). Validation and test have no</w:t>
       </w:r>
       <w:r>
         <w:t xml:space="preserve"> </w:t>
@@ -1142,7 +1163,7 @@
         <w:t xml:space="preserve"> </w:t>
       </w:r>
       <w:r>
-        <w:t xml:space="preserve">boxes at all and only 3–4</w:t>
+        <w:t xml:space="preserve">at all and only 3–4</w:t>
       </w:r>
       <w:r>
         <w:t xml:space="preserve"> </w:t>
@@ -1172,7 +1193,7 @@
         <w:t xml:space="preserve"> </w:t>
       </w:r>
       <w:r>
-        <w:t xml:space="preserve">boxes each. Per-class accuracy can only be estimated for</w:t>
+        <w:t xml:space="preserve">boxes each. Only</w:t>
       </w:r>
       <w:r>
         <w:t xml:space="preserve"> </w:t>
@@ -1199,7 +1220,10 @@
         <w:t xml:space="preserve">unsealed</w:t>
       </w:r>
       <w:r>
-        <w:t xml:space="preserve">. A class is reported as</w:t>
+        <w:t xml:space="preserve"> </w:t>
+      </w:r>
+      <w:r>
+        <w:t xml:space="preserve">can be measured, so I call a class</w:t>
       </w:r>
       <w:r>
         <w:t xml:space="preserve"> </w:t>
@@ -1215,7 +1239,7 @@
         <w:t xml:space="preserve"> </w:t>
       </w:r>
       <w:r>
-        <w:t xml:space="preserve">only with at least 10 test boxes; below that, a single box changes AP by 10 points or more.</w:t>
+        <w:t xml:space="preserve">only if it has at least 10 test boxes — below that, one box moves AP by 10 points or more.</w:t>
       </w:r>
     </w:p>
     <w:p>
@@ -1231,13 +1255,13 @@
           <w:bCs/>
           <w:b/>
         </w:rPr>
-        <w:t xml:space="preserve">Few good trays to test against.</w:t>
-      </w:r>
-      <w:r>
-        <w:t xml:space="preserve"> </w:t>
-      </w:r>
-      <w:r>
-        <w:t xml:space="preserve">Only 12 of the 80 test images contain no defect, so a false-reject rate measured on the test split has a wide confidence interval.</w:t>
+        <w:t xml:space="preserve">There are hardly any good trays to test on.</w:t>
+      </w:r>
+      <w:r>
+        <w:t xml:space="preserve"> </w:t>
+      </w:r>
+      <w:r>
+        <w:t xml:space="preserve">Only 12 of the 80 test images have no defect, so any false-reject rate measured there has a very wide confidence interval.</w:t>
       </w:r>
     </w:p>
     <w:p>
@@ -1249,13 +1273,13 @@
           <w:bCs/>
           <w:b/>
         </w:rPr>
-        <w:t xml:space="preserve">Response.</w:t>
-      </w:r>
-      <w:r>
-        <w:t xml:space="preserve"> </w:t>
-      </w:r>
-      <w:r>
-        <w:t xml:space="preserve">Two dataset variants are built automatically (</w:t>
+        <w:t xml:space="preserve">What I did about it.</w:t>
+      </w:r>
+      <w:r>
+        <w:t xml:space="preserve"> </w:t>
+      </w:r>
+      <w:r>
+        <w:t xml:space="preserve">The code builds two versions of the dataset automatically (</w:t>
       </w:r>
       <w:r>
         <w:rPr>
@@ -1298,7 +1322,10 @@
         <w:t xml:space="preserve">)</w:t>
       </w:r>
       <w:r>
-        <w:t xml:space="preserve">: the given split, keeping one augmented copy per training frame. The detector applies its own, wider colour augmentation, so the copies mostly triple training time.</w:t>
+        <w:t xml:space="preserve"> </w:t>
+      </w:r>
+      <w:r>
+        <w:t xml:space="preserve">— the split as given, keeping one of the three copies per training frame. The detector does its own, wider colour augmentation anyway, so the extra copies mostly just tripled training time.</w:t>
       </w:r>
       <w:r>
         <w:t xml:space="preserve"> </w:t>
@@ -1332,7 +1359,10 @@
         <w:t xml:space="preserve">)</w:t>
       </w:r>
       <w:r>
-        <w:t xml:space="preserve">: all source frames are cut into blocks of 300 consecutive frame numbers; whole blocks go to test or validation, and training frames within 60 frames of any held-out frame are removed. The result is 872 training, 155 validation and 173 test frames, with 72 training frames removed by the guard band. The block split also happens to contain more test boxes for the two evaluable classes (98</w:t>
+        <w:t xml:space="preserve"> </w:t>
+      </w:r>
+      <w:r>
+        <w:t xml:space="preserve">— all source frames are cut into blocks of 300 consecutive frame numbers; whole blocks go to test or validation, and any training frame within 60 frames of a held-out one is dropped. That leaves 872 training, 155 validation and 173 test frames (72 training frames lost to the buffer). As a bonus, its test set has more boxes for the two evaluable classes (98</w:t>
       </w:r>
       <w:r>
         <w:t xml:space="preserve"> </w:t>
@@ -1356,7 +1386,7 @@
         <w:t xml:space="preserve">unsealed</w:t>
       </w:r>
       <w:r>
-        <w:t xml:space="preserve">) and more good trays (39), so its estimates are less noisy.</w:t>
+        <w:t xml:space="preserve">) and more good trays (39), so its numbers are less noisy.</w:t>
       </w:r>
     </w:p>
     <w:p>
@@ -1364,7 +1394,7 @@
         <w:pStyle w:val="BodyText"/>
       </w:pPr>
       <w:r>
-        <w:t xml:space="preserve">Comparing the two splits measures how optimistic the predefined split is, instead of assuming it (Section 5.4).</w:t>
+        <w:t xml:space="preserve">Running everything on both splits lets me measure how optimistic the predefined split is, rather than just asserting it (Section 5.4).</w:t>
       </w:r>
     </w:p>
     <w:p>
@@ -1446,7 +1476,7 @@
         <w:t xml:space="preserve">rasherqc.synthetic</w:t>
       </w:r>
       <w:r>
-        <w:t xml:space="preserve">) renders tray images in the same YOLO layout, with the same class names, and with</w:t>
+        <w:t xml:space="preserve">) draws tray images in the same YOLO format, with the same class names and — the whole point —</w:t>
       </w:r>
       <w:r>
         <w:t xml:space="preserve"> </w:t>
@@ -1456,10 +1486,10 @@
           <w:bCs/>
           <w:b/>
         </w:rPr>
-        <w:t xml:space="preserve">exactly known boxes</w:t>
-      </w:r>
-      <w:r>
-        <w:t xml:space="preserve">. This plays the role that manufactured solutions play in numerical methods: it verifies that the code is correct — labels, metrics, thresholds, decision logic — independently of noisy real labels, and it isolates single factors such as defect size and glare. It renders shingled streaky rashers on a tray with a sealed flange and film reflections, plus each defect type. It says nothing about accuracy on real trays. In fact, the real scenes (clear trays partly in view on a dark textured belt) look quite different, which is itself a reminder of why the synthetic set is used only for verification.</w:t>
+        <w:t xml:space="preserve">boxes that are exactly right</w:t>
+      </w:r>
+      <w:r>
+        <w:t xml:space="preserve">. It does the job a manufactured solution does in numerical methods: if the pipeline can’t score perfect labels perfectly, the bug is in my code, not in the data. It also lets me vary one thing at a time, like defect size or glare. It tells me nothing about real trays, though, and the real scenes (clear trays half in view on a dark textured belt) look quite different from what I generated. So it is used for verification only.</w:t>
       </w:r>
     </w:p>
     <w:bookmarkEnd w:id="26"/>
@@ -1494,13 +1524,13 @@
       </w:r>
     </w:p>
     <w:bookmarkEnd w:id="28"/>
-    <w:bookmarkStart w:id="29" w:name="Xfb4c5daee387b0926ae2cccd5cc40a1426479e9"/>
+    <w:bookmarkStart w:id="29" w:name="X6e5a514276f75270dcee12109984b4f4df9326f"/>
     <w:p>
       <w:pPr>
         <w:pStyle w:val="Heading3"/>
       </w:pPr>
       <w:r>
-        <w:t xml:space="preserve">3.2 Main method: YOLOv8n object detector with transfer learning</w:t>
+        <w:t xml:space="preserve">3.2 Main method: YOLOv8n with transfer learning</w:t>
       </w:r>
     </w:p>
     <w:p>
@@ -1518,7 +1548,7 @@
         <w:t xml:space="preserve"> </w:t>
       </w:r>
       <w:r>
-        <w:t xml:space="preserve">YOLOv8 is a one-stage, anchor-free convolutional detector. A CSP-Darknet backbone with C2f blocks extracts feature maps at strides 8, 16 and 32. A path-aggregation neck fuses them, so small defects (a lifted film corner) and large ones (a loose rasher) are both represented. A decoupled head predicts, for every cell of each feature map, the class probabilities and the distances from the cell to the four box edges (each as a discrete probability distribution). Training minimises the weighted sum of three losses: binary cross-entropy for the classes, CIoU for box overlap, and distribution focal loss for the edge distributions. Ground-truth boxes are assigned to cells by a task-aligned assigner. The loss is minimised by mini-batch stochastic gradient descent with the AdamW optimiser, and the model is stored at the epoch with the best validation fitness (0.1·mAP@0.5 + 0.9·mAP@0.5:0.95). At inference, non-maximum suppression (IoU 0.6) removes duplicate boxes.</w:t>
+        <w:t xml:space="preserve">YOLOv8 is a one-stage, anchor-free convolutional detector. A CSP-Darknet backbone built from C2f blocks pulls out feature maps at strides 8, 16 and 32, and a path-aggregation neck mixes them, so a small defect (a lifted film corner) and a big one (a loose rasher) both get represented. A decoupled head then predicts, for every cell of every feature map, the class probabilities and the distances from that cell to the four box edges, each as a small probability distribution. Training minimises the weighted sum of three losses: binary cross-entropy on the classes, CIoU on box overlap, and distribution focal loss on the edge distributions. A task-aligned assigner decides which cells are responsible for which ground-truth box. The optimiser is AdamW (mini-batch stochastic gradient descent with decoupled weight decay), and the weights kept are those from the epoch with the best validation fitness, 0.1·mAP@0.5 + 0.9·mAP@0.5:0.95. At inference, non-maximum suppression (IoU 0.6) throws away duplicate boxes.</w:t>
       </w:r>
     </w:p>
     <w:p>
@@ -1530,7 +1560,7 @@
           <w:bCs/>
           <w:b/>
         </w:rPr>
-        <w:t xml:space="preserve">Why it was selected.</w:t>
+        <w:t xml:space="preserve">Why this one.</w:t>
       </w:r>
       <w:r>
         <w:t xml:space="preserve"> </w:t>
@@ -1565,7 +1595,7 @@
         <w:t xml:space="preserve">and localise</w:t>
       </w:r>
       <w:r>
-        <w:t xml:space="preserve">, and an operator needs to see where the fault is.</w:t>
+        <w:t xml:space="preserve">, and an operator needs to know where to look.</w:t>
       </w:r>
       <w:r>
         <w:t xml:space="preserve"> </w:t>
@@ -1581,13 +1611,13 @@
           <w:bCs/>
           <w:b/>
         </w:rPr>
-        <w:t xml:space="preserve">Speed.</w:t>
-      </w:r>
-      <w:r>
-        <w:t xml:space="preserve"> </w:t>
-      </w:r>
-      <w:r>
-        <w:t xml:space="preserve">One forward pass per image suits a line running at about one tray per second. The nano variant has 3.0 M parameters, so it can run on a CPU (Section 6).</w:t>
+        <w:t xml:space="preserve">It’s fast.</w:t>
+      </w:r>
+      <w:r>
+        <w:t xml:space="preserve"> </w:t>
+      </w:r>
+      <w:r>
+        <w:t xml:space="preserve">One forward pass per image fits a line doing about one tray a second. The nano version has 3.0 M parameters and runs fine on a CPU (Section 6).</w:t>
       </w:r>
       <w:r>
         <w:t xml:space="preserve"> </w:t>
@@ -1603,13 +1633,13 @@
           <w:bCs/>
           <w:b/>
         </w:rPr>
-        <w:t xml:space="preserve">Little data.</w:t>
-      </w:r>
-      <w:r>
-        <w:t xml:space="preserve"> </w:t>
-      </w:r>
-      <w:r>
-        <w:t xml:space="preserve">Starting from COCO-pretrained weights reuses generic edge, texture and shape features, which matters with only 1,085 distinct training frames. This is tested directly against training from scratch (Section 4).</w:t>
+        <w:t xml:space="preserve">It copes with little data.</w:t>
+      </w:r>
+      <w:r>
+        <w:t xml:space="preserve"> </w:t>
+      </w:r>
+      <w:r>
+        <w:t xml:space="preserve">Starting from COCO-pretrained weights reuses generic edge, texture and shape features — handy with only 1,085 distinct training frames. I test that claim directly against training from scratch (Section 4).</w:t>
       </w:r>
       <w:r>
         <w:t xml:space="preserve"> </w:t>
@@ -1625,13 +1655,13 @@
           <w:bCs/>
           <w:b/>
         </w:rPr>
-        <w:t xml:space="preserve">The data matches.</w:t>
-      </w:r>
-      <w:r>
-        <w:t xml:space="preserve"> </w:t>
-      </w:r>
-      <w:r>
-        <w:t xml:space="preserve">The dataset is labelled with boxes, so no re-annotation is needed.</w:t>
+        <w:t xml:space="preserve">The labels fit.</w:t>
+      </w:r>
+      <w:r>
+        <w:t xml:space="preserve"> </w:t>
+      </w:r>
+      <w:r>
+        <w:t xml:space="preserve">The data is already boxed, so no re-labelling.</w:t>
       </w:r>
       <w:r>
         <w:t xml:space="preserve"> </w:t>
@@ -1647,13 +1677,13 @@
           <w:bCs/>
           <w:b/>
         </w:rPr>
-        <w:t xml:space="preserve">Reproducibility.</w:t>
-      </w:r>
-      <w:r>
-        <w:t xml:space="preserve"> </w:t>
-      </w:r>
-      <w:r>
-        <w:t xml:space="preserve">A widely used, documented library; the same code runs on CPU and GPU.</w:t>
+        <w:t xml:space="preserve">It’s reproducible.</w:t>
+      </w:r>
+      <w:r>
+        <w:t xml:space="preserve"> </w:t>
+      </w:r>
+      <w:r>
+        <w:t xml:space="preserve">Widely used, well documented, and the same code runs on CPU and GPU.</w:t>
       </w:r>
     </w:p>
     <w:p>
@@ -1671,25 +1701,25 @@
         <w:t xml:space="preserve"> </w:t>
       </w:r>
       <w:r>
-        <w:t xml:space="preserve">1. Defects are visible in a single top-view RGB frame.</w:t>
-      </w:r>
-      <w:r>
-        <w:t xml:space="preserve"> </w:t>
-      </w:r>
-      <w:r>
-        <w:t xml:space="preserve">2. Box labels are consistent enough to learn from.</w:t>
-      </w:r>
-      <w:r>
-        <w:t xml:space="preserve"> </w:t>
-      </w:r>
-      <w:r>
-        <w:t xml:space="preserve">3. The training, validation and test images come from the same process: same camera, belt and trays.</w:t>
-      </w:r>
-      <w:r>
-        <w:t xml:space="preserve"> </w:t>
-      </w:r>
-      <w:r>
-        <w:t xml:space="preserve">4. A tray’s status can be summarised by its most confident defect.</w:t>
+        <w:t xml:space="preserve">1. A defect is visible in a single top-view RGB frame.</w:t>
+      </w:r>
+      <w:r>
+        <w:t xml:space="preserve"> </w:t>
+      </w:r>
+      <w:r>
+        <w:t xml:space="preserve">2. The box labels are consistent enough to learn from.</w:t>
+      </w:r>
+      <w:r>
+        <w:t xml:space="preserve"> </w:t>
+      </w:r>
+      <w:r>
+        <w:t xml:space="preserve">3. Training, validation and test images come from the same process — same camera, belt and trays.</w:t>
+      </w:r>
+      <w:r>
+        <w:t xml:space="preserve"> </w:t>
+      </w:r>
+      <w:r>
+        <w:t xml:space="preserve">4. A tray’s status can be summed up by its most confident defect.</w:t>
       </w:r>
     </w:p>
     <w:p>
@@ -1728,7 +1758,7 @@
         <w:t xml:space="preserve">rasherqc.detector.train</w:t>
       </w:r>
       <w:r>
-        <w:t xml:space="preserve">). Input 416 px on the long side; 60 epochs on GPU (20 on the CPU development run), batch 16, AdamW with the learning rate chosen automatically (≈1.1 × 10⁻³), early-stopping patience 15, seed 42 with</w:t>
+        <w:t xml:space="preserve">). Input 416 px on the long side; 60 epochs on the GPU (20 on an early CPU run), batch 16, AdamW with an automatically chosen learning rate (≈ 1.1 × 10⁻³), early-stopping patience 15, seed 42 with</w:t>
       </w:r>
       <w:r>
         <w:t xml:space="preserve"> </w:t>
@@ -1740,7 +1770,22 @@
         <w:t xml:space="preserve">deterministic=True</w:t>
       </w:r>
       <w:r>
-        <w:t xml:space="preserve">. Augmentation: mosaic (switched off for the last 5 epochs), horizontal and vertical flips (a top-view camera has no preferred orientation), and HSV jitter. Rotation is disabled, because the trays always run along the belt.</w:t>
+        <w:t xml:space="preserve">. Augmentation: mosaic (turned off for the last 5 epochs), horizontal and vertical flips (a camera looking straight down has no</w:t>
+      </w:r>
+      <w:r>
+        <w:t xml:space="preserve"> </w:t>
+      </w:r>
+      <w:r>
+        <w:t xml:space="preserve">“</w:t>
+      </w:r>
+      <w:r>
+        <w:t xml:space="preserve">up</w:t>
+      </w:r>
+      <w:r>
+        <w:t xml:space="preserve">”</w:t>
+      </w:r>
+      <w:r>
+        <w:t xml:space="preserve">), and HSV jitter. No rotation — the trays always run along the belt.</w:t>
       </w:r>
     </w:p>
     <w:p>
@@ -1767,7 +1812,7 @@
         <w:t xml:space="preserve"> </w:t>
       </w:r>
       <w:r>
-        <w:t xml:space="preserve">wraps Ultralytics 8.4. Our wrapper fixes one silent pitfall: Ultralytics expects OpenCV’s BGR channel order, while the rest of the code uses RGB. A unit test checks that passing an image as an array or as a file gives identical detections.</w:t>
+        <w:t xml:space="preserve">wraps Ultralytics 8.4. One trap worth mentioning: Ultralytics expects OpenCV’s BGR channel order, while everything else in my code is RGB. Get it wrong and nothing crashes; red meat just quietly turns blue. A unit test checks that passing an image as an array or as a file gives identical detections.</w:t>
       </w:r>
     </w:p>
     <w:bookmarkEnd w:id="29"/>
@@ -1846,7 +1891,7 @@
         <w:t xml:space="preserve">fail</w:t>
       </w:r>
       <w:r>
-        <w:t xml:space="preserve">;</w:t>
+        <w:t xml:space="preserve">,</w:t>
       </w:r>
       <w:r>
         <w:t xml:space="preserve"> </w:t>
@@ -1913,7 +1958,7 @@
         <w:t xml:space="preserve">fail</w:t>
       </w:r>
       <w:r>
-        <w:t xml:space="preserve">; otherwise</w:t>
+        <w:t xml:space="preserve">, otherwise</w:t>
       </w:r>
       <w:r>
         <w:t xml:space="preserve"> </w:t>
@@ -1926,7 +1971,7 @@
         <w:t xml:space="preserve">PASS</w:t>
       </w:r>
       <w:r>
-        <w:t xml:space="preserve">. Both thresholds are chosen on the</w:t>
+        <w:t xml:space="preserve">. Both thresholds are set on the</w:t>
       </w:r>
       <w:r>
         <w:t xml:space="preserve"> </w:t>
@@ -1961,7 +2006,7 @@
         <w:t xml:space="preserve"> </w:t>
       </w:r>
       <w:r>
-        <w:t xml:space="preserve">is the highest threshold that still catches at least 95 % of defective validation trays.</w:t>
+        <w:t xml:space="preserve">is the highest threshold that still catches at least 95 % of defective validation trays;</w:t>
       </w:r>
       <w:r>
         <w:t xml:space="preserve"> </w:t>
@@ -1980,7 +2025,7 @@
         <w:t xml:space="preserve"> </w:t>
       </w:r>
       <w:r>
-        <w:t xml:space="preserve">is the highest that catches at least 99 %, so trays in between go to a person. The targets express the unequal costs of the two errors (Section 1). They are engineering choices to be agreed with the plant, not results.</w:t>
+        <w:t xml:space="preserve">is the highest that catches at least 99 %, and anything in between goes to a person. Those targets encode the lopsided costs from Section 1. They’re engineering choices a plant would set for itself, not results.</w:t>
       </w:r>
     </w:p>
     <w:bookmarkEnd w:id="30"/>
@@ -2002,7 +2047,7 @@
         <w:pStyle w:val="Compact"/>
       </w:pPr>
       <w:r>
-        <w:t xml:space="preserve">Boxes are axis-aligned, so box area overstates the true defect area. It is useful for ranking severity, not for measuring it.</w:t>
+        <w:t xml:space="preserve">Boxes are axis-aligned, so box area overstates the true defect area. Fine for ranking severity, not for measuring it.</w:t>
       </w:r>
     </w:p>
     <w:p>
@@ -2014,7 +2059,7 @@
         <w:pStyle w:val="Compact"/>
       </w:pPr>
       <w:r>
-        <w:t xml:space="preserve">The model cannot detect defect types it has (almost) never seen: there are 6</w:t>
+        <w:t xml:space="preserve">The model can’t find what it has barely seen: there are 6</w:t>
       </w:r>
       <w:r>
         <w:t xml:space="preserve"> </w:t>
@@ -2041,7 +2086,7 @@
         <w:pStyle w:val="Compact"/>
       </w:pPr>
       <w:r>
-        <w:t xml:space="preserve">Confidence scores are not calibrated probabilities. Thresholds must be re-chosen if the camera, lighting or product changes.</w:t>
+        <w:t xml:space="preserve">Confidence scores aren’t calibrated probabilities. Change the camera, lighting or product and the thresholds have to be picked again.</w:t>
       </w:r>
     </w:p>
     <w:p>
@@ -2053,7 +2098,7 @@
         <w:pStyle w:val="Compact"/>
       </w:pPr>
       <w:r>
-        <w:t xml:space="preserve">Ultralytics is licensed under AGPL-3.0. A closed-source commercial deployment would need a commercial licence or a different detector.</w:t>
+        <w:t xml:space="preserve">Ultralytics is AGPL-3.0. A closed-source commercial version would need a commercial licence or a different detector.</w:t>
       </w:r>
     </w:p>
     <w:bookmarkEnd w:id="31"/>
@@ -2214,22 +2259,22 @@
                 <w:bCs/>
                 <w:b/>
               </w:rPr>
-              <w:t xml:space="preserve">YOLOv8n trained from scratch</w:t>
-            </w:r>
-            <w:r>
-              <w:t xml:space="preserve">: same architecture, data, settings and seed; random initial weights</w:t>
-            </w:r>
-          </w:p>
-        </w:tc>
-        <w:tc>
-          <w:tcPr/>
-          <w:p>
-            <w:pPr>
-              <w:pStyle w:val="Compact"/>
-              <w:jc w:val="left"/>
-            </w:pPr>
-            <w:r>
-              <w:t xml:space="preserve">whether transfer learning is worth it at this data size</w:t>
+              <w:t xml:space="preserve">YOLOv8n from scratch</w:t>
+            </w:r>
+            <w:r>
+              <w:t xml:space="preserve">: same architecture, data, settings and seed; random starting weights</w:t>
+            </w:r>
+          </w:p>
+        </w:tc>
+        <w:tc>
+          <w:tcPr/>
+          <w:p>
+            <w:pPr>
+              <w:pStyle w:val="Compact"/>
+              <w:jc w:val="left"/>
+            </w:pPr>
+            <w:r>
+              <w:t xml:space="preserve">whether transfer learning pays off at this data size</w:t>
             </w:r>
           </w:p>
         </w:tc>
@@ -2286,19 +2331,19 @@
               <w:jc w:val="left"/>
             </w:pPr>
             <w:r>
-              <w:t xml:space="preserve">whether a classical, interpretable, cheap pipeline is good enough for the PASS/FAIL decision</w:t>
-            </w:r>
-          </w:p>
-        </w:tc>
-        <w:tc>
-          <w:tcPr/>
-          <w:p>
-            <w:pPr>
-              <w:pStyle w:val="Compact"/>
-              <w:jc w:val="left"/>
-            </w:pPr>
-            <w:r>
-              <w:t xml:space="preserve">no (image-level only)</w:t>
+              <w:t xml:space="preserve">whether a cheap, classical, explainable pipeline is good enough for PASS/FAIL</w:t>
+            </w:r>
+          </w:p>
+        </w:tc>
+        <w:tc>
+          <w:tcPr/>
+          <w:p>
+            <w:pPr>
+              <w:pStyle w:val="Compact"/>
+              <w:jc w:val="left"/>
+            </w:pPr>
+            <w:r>
+              <w:t xml:space="preserve">no (whole image only)</w:t>
             </w:r>
           </w:p>
         </w:tc>
@@ -2309,7 +2354,7 @@
         <w:pStyle w:val="BodyText"/>
       </w:pPr>
       <w:r>
-        <w:t xml:space="preserve">The baseline’s features were designed around the physics of each defect. In a correct pack the rashers lie parallel, so edge orientation is coherent; a loose rasher adds a second dominant orientation. Wrinkles and lifted film edges are thin, bright structures, picked up by a white top-hat filter. An unsealed flange shows a dark gap, picked up by a black top-hat filter. A 3 × 3 spatial pyramid pools these responses so that a small local defect is not averaged away. All three methods produce a 0–1 tray score and pass through the</w:t>
+        <w:t xml:space="preserve">The baseline’s features were built around what each defect physically looks like. In a good pack the rashers lie parallel, so edge orientations agree; a loose rasher adds a second dominant direction. Wrinkles and lifted film edges are thin and bright, which a white top-hat filter picks up; an unsealed flange shows a dark gap, which a black top-hat picks up. A 3 × 3 spatial pyramid pools these so a small local defect doesn’t get averaged away. All three methods produce a 0–1 tray score and go through the</w:t>
       </w:r>
       <w:r>
         <w:t xml:space="preserve"> </w:t>
@@ -2325,7 +2370,7 @@
         <w:t xml:space="preserve"> </w:t>
       </w:r>
       <w:r>
-        <w:t xml:space="preserve">threshold procedure (Section 3.3), so their tray decisions are directly comparable.</w:t>
+        <w:t xml:space="preserve">threshold procedure (Section 3.3), so their tray decisions compare like for like.</w:t>
       </w:r>
     </w:p>
     <w:p>
@@ -3026,7 +3071,7 @@
         <w:t xml:space="preserve">07_operating_points.py</w:t>
       </w:r>
       <w:r>
-        <w:t xml:space="preserve">), shown to make the trade-off visible; the decision thresholds themselves are chosen on validation only.</w:t>
+        <w:t xml:space="preserve">) to show the trade-off. The decision thresholds themselves are only ever chosen on validation.</w:t>
       </w:r>
     </w:p>
     <w:p>
@@ -3130,13 +3175,13 @@
           <w:bCs/>
           <w:b/>
         </w:rPr>
-        <w:t xml:space="preserve">Selection.</w:t>
-      </w:r>
-      <w:r>
-        <w:t xml:space="preserve"> </w:t>
-      </w:r>
-      <w:r>
-        <w:t xml:space="preserve">The pretrained detector (A) is selected. It is the best or equal-best on every accuracy measure on both splits; transfer learning matters most for the hard class —</w:t>
+        <w:t xml:space="preserve">Which one, and why.</w:t>
+      </w:r>
+      <w:r>
+        <w:t xml:space="preserve"> </w:t>
+      </w:r>
+      <w:r>
+        <w:t xml:space="preserve">I picked the pretrained detector (A). It is best or tied-best on every accuracy measure on both splits. Pretraining matters most on the hard class:</w:t>
       </w:r>
       <w:r>
         <w:t xml:space="preserve"> </w:t>
@@ -3151,7 +3196,7 @@
         <w:t xml:space="preserve"> </w:t>
       </w:r>
       <w:r>
-        <w:t xml:space="preserve">AP 0.70 vs 0.48 (block) and 0.33 vs 0.13 (predefined) — while</w:t>
+        <w:t xml:space="preserve">AP is 0.70 against 0.48 from scratch on the block split, and 0.33 against 0.13 on the predefined one.</w:t>
       </w:r>
       <w:r>
         <w:t xml:space="preserve"> </w:t>
@@ -3163,51 +3208,49 @@
         <w:t xml:space="preserve">unsealed</w:t>
       </w:r>
       <w:r>
-        <w:t xml:space="preserve">, a large and high-contrast pattern, is learned almost equally well from scratch. B’s training curve was still rising at epoch 60 (best epoch 54) whereas A had plateaued (best epoch 49; 42 with early stopping on the predefined split), so part of B’s gap is a matter of training budget; at equal budget, pretraining wins. The classical baseline (C) is</w:t>
-      </w:r>
-      <w:r>
-        <w:t xml:space="preserve"> </w:t>
-      </w:r>
+        <w:t xml:space="preserve"> </w:t>
+      </w:r>
+      <w:r>
+        <w:t xml:space="preserve">— big and high-contrast — is learned almost as well from scratch. To be fair to B, its validation curve was still climbing at epoch 60 (best epoch 54), while A had levelled off (best epoch 49, or 42 with early stopping on the predefined split). Some of B’s gap is just training budget. At the same budget, though, pretraining wins.</w:t>
+      </w:r>
+    </w:p>
+    <w:p>
+      <w:pPr>
+        <w:pStyle w:val="BodyText"/>
+      </w:pPr>
+      <w:r>
+        <w:t xml:space="preserve">The classical baseline (C) isn’t good enough. On the block split it has to fail 74 % of good trays to catch 90 % of bad ones, it falls apart under every perturbation I tried (Section 6.4), and it can’t say where the defect is. Its feature importances were the interesting part: the top features were the low percentiles of CIE b* (roughly, how much bare tray and film is visible next to meat) and the background’s edge-orientation histogram. So the forest is mostly working out</w:t>
+      </w:r>
+      <w:r>
+        <w:t xml:space="preserve"> </w:t>
+      </w:r>
+      <w:r>
+        <w:rPr>
+          <w:iCs/>
+          <w:i/>
+        </w:rPr>
+        <w:t xml:space="preserve">how much of a tray is in the frame</w:t>
+      </w:r>
+      <w:r>
+        <w:t xml:space="preserve">, not spotting defects — which explains why it transfers so badly to unseen trays. Its one real advantage is cost: no GPU, and only image-level labels.</w:t>
+      </w:r>
+    </w:p>
+    <w:p>
+      <w:pPr>
+        <w:pStyle w:val="BodyText"/>
+      </w:pPr>
       <w:r>
         <w:rPr>
           <w:bCs/>
           <w:b/>
         </w:rPr>
-        <w:t xml:space="preserve">not adequate</w:t>
-      </w:r>
-      <w:r>
-        <w:t xml:space="preserve">: on the block split it has to reject 74 % of good trays to catch 90 % of defective ones, it collapses under every perturbation (Section 6.4), and it cannot say where the defect is. Its feature importances are informative, though: the most useful features were the low percentiles of CIE b* (yellow-blue, i.e. how much exposed tray/film vs meat is visible) and the edge-orientation histogram of the background — the forest is largely detecting</w:t>
-      </w:r>
-      <w:r>
-        <w:t xml:space="preserve"> </w:t>
-      </w:r>
-      <w:r>
-        <w:rPr>
-          <w:iCs/>
-          <w:i/>
-        </w:rPr>
-        <w:t xml:space="preserve">how much of a tray is in the frame</w:t>
-      </w:r>
-      <w:r>
-        <w:t xml:space="preserve">, not the defect itself, which explains its poor transfer to unseen trays. Its one strength is cost: no GPU and image-level labels only.</w:t>
-      </w:r>
-    </w:p>
-    <w:p>
-      <w:pPr>
-        <w:pStyle w:val="BodyText"/>
-      </w:pPr>
-      <w:r>
-        <w:rPr>
-          <w:bCs/>
-          <w:b/>
-        </w:rPr>
-        <w:t xml:space="preserve">What A cannot yet do.</w:t>
-      </w:r>
-      <w:r>
-        <w:t xml:space="preserve"> </w:t>
-      </w:r>
-      <w:r>
-        <w:t xml:space="preserve">Even A does not meet a demanding operating requirement on unseen trays. Catching ≈ 90 % of defective trays costs ≈ 41 % false rejects; at 80 % recall the false-reject rate drops to ≈ 18 %. The error gallery explains much of this (Section 5.3): false rejects are mostly trays only partly in the frame, where the model detects a plausible</w:t>
+        <w:t xml:space="preserve">What A still can’t do.</w:t>
+      </w:r>
+      <w:r>
+        <w:t xml:space="preserve"> </w:t>
+      </w:r>
+      <w:r>
+        <w:t xml:space="preserve">Even A falls short of a demanding target on unseen trays. Catching about 90 % of defective trays costs about 41 % false rejects; at 80 % recall that drops to about 18 %. The error gallery (Section 5.3) shows where most of this comes from: trays only partly in the frame, where the model finds a plausible</w:t>
       </w:r>
       <w:r>
         <w:t xml:space="preserve"> </w:t>
@@ -3222,7 +3265,7 @@
         <w:t xml:space="preserve"> </w:t>
       </w:r>
       <w:r>
-        <w:t xml:space="preserve">at the film edge that is not annotated.</w:t>
+        <w:t xml:space="preserve">at the film edge that nobody labelled.</w:t>
       </w:r>
     </w:p>
     <w:bookmarkEnd w:id="39"/>
@@ -3306,31 +3349,31 @@
               <w:jc w:val="left"/>
             </w:pPr>
             <w:r>
-              <w:t xml:space="preserve">Is the code correct?</w:t>
-            </w:r>
-          </w:p>
-        </w:tc>
-        <w:tc>
-          <w:tcPr/>
-          <w:p>
-            <w:pPr>
-              <w:pStyle w:val="Compact"/>
-              <w:jc w:val="left"/>
-            </w:pPr>
-            <w:r>
-              <w:t xml:space="preserve">Verification tests against hand-calculated cases; synthetic data with exact ground truth; our metric code cross-checked against Ultralytics’ validator</w:t>
-            </w:r>
-          </w:p>
-        </w:tc>
-        <w:tc>
-          <w:tcPr/>
-          <w:p>
-            <w:pPr>
-              <w:pStyle w:val="Compact"/>
-              <w:jc w:val="left"/>
-            </w:pPr>
-            <w:r>
-              <w:t xml:space="preserve">Tests pass; our mAP equals the library’s to within interpolation differences</w:t>
+              <w:t xml:space="preserve">Is the code right?</w:t>
+            </w:r>
+          </w:p>
+        </w:tc>
+        <w:tc>
+          <w:tcPr/>
+          <w:p>
+            <w:pPr>
+              <w:pStyle w:val="Compact"/>
+              <w:jc w:val="left"/>
+            </w:pPr>
+            <w:r>
+              <w:t xml:space="preserve">Tests against hand-calculated cases; synthetic data with exact ground truth; my metric code checked against Ultralytics’ validator</w:t>
+            </w:r>
+          </w:p>
+        </w:tc>
+        <w:tc>
+          <w:tcPr/>
+          <w:p>
+            <w:pPr>
+              <w:pStyle w:val="Compact"/>
+              <w:jc w:val="left"/>
+            </w:pPr>
+            <w:r>
+              <w:t xml:space="preserve">Tests pass; my mAP matches the library’s up to interpolation differences</w:t>
             </w:r>
           </w:p>
         </w:tc>
@@ -3410,7 +3453,7 @@
               <w:t xml:space="preserve"> </w:t>
             </w:r>
             <w:r>
-              <w:t xml:space="preserve">to test; 95 % bootstrap confidence intervals (1,000 resamples of test images)</w:t>
+              <w:t xml:space="preserve">to test; 95 % bootstrap CIs (1,000 resamples of test images)</w:t>
             </w:r>
           </w:p>
         </w:tc>
@@ -3448,7 +3491,7 @@
               <w:jc w:val="left"/>
             </w:pPr>
             <w:r>
-              <w:t xml:space="preserve">Same pipeline on the leakage-aware block split</w:t>
+              <w:t xml:space="preserve">Same pipeline on the block split</w:t>
             </w:r>
           </w:p>
         </w:tc>
@@ -3486,7 +3529,7 @@
               <w:jc w:val="left"/>
             </w:pPr>
             <w:r>
-              <w:t xml:space="preserve">Controlled perturbations of test images, thresholds kept fixed</w:t>
+              <w:t xml:space="preserve">Controlled perturbations of test images, thresholds fixed</w:t>
             </w:r>
           </w:p>
         </w:tc>
@@ -3519,7 +3562,7 @@
         <w:t xml:space="preserve"> </w:t>
       </w:r>
       <w:r>
-        <w:t xml:space="preserve">mAP is the standard detection measure. It includes localisation (IoU ≥ 0.5) and ranks predictions at every confidence level. The line, however, acts on trays, so the decision metrics come first: recall of FAIL trays, because escapes are the costly error, and the false-reject rate, because it is the cost of operating the system. Bootstrap intervals are reported because the test set is small.</w:t>
+        <w:t xml:space="preserve">mAP is the standard for detection: it includes localisation (IoU ≥ 0.5) and ranks predictions at every confidence level. But the line acts on trays, not boxes, so the decision metrics come first — recall on FAIL trays, because escapes are the expensive mistake, and the false-reject rate, because that is what running the system costs. Bootstrap intervals are there because the test sets are small.</w:t>
       </w:r>
       <w:r>
         <w:t xml:space="preserve"> </w:t>
@@ -3529,13 +3572,13 @@
           <w:bCs/>
           <w:b/>
         </w:rPr>
-        <w:t xml:space="preserve">Influence on model selection:</w:t>
-      </w:r>
-      <w:r>
-        <w:t xml:space="preserve"> </w:t>
-      </w:r>
-      <w:r>
-        <w:t xml:space="preserve">validation data chose the best epoch, the thresholds and the baseline’s hyper-parameters (by cross-validation on training data). The test split was used once, after every choice had been made.</w:t>
+        <w:t xml:space="preserve">Effect on model selection:</w:t>
+      </w:r>
+      <w:r>
+        <w:t xml:space="preserve"> </w:t>
+      </w:r>
+      <w:r>
+        <w:t xml:space="preserve">validation data picked the best epoch and the thresholds, and cross-validation on training data picked the baseline’s hyper-parameters. The test split was touched once, after all of that.</w:t>
       </w:r>
     </w:p>
     <w:bookmarkEnd w:id="40"/>
@@ -3553,7 +3596,7 @@
         <w:pStyle w:val="FirstParagraph"/>
       </w:pPr>
       <w:r>
-        <w:t xml:space="preserve">Verification asks whether the code computes what it claims, independently of whether the model is good. Five checks were used (details in Appendix A):</w:t>
+        <w:t xml:space="preserve">Verification asks a narrower question than validation: does the code compute what it says, whether or not the model is any good? I used five checks (details in Appendix A).</w:t>
       </w:r>
       <w:r>
         <w:t xml:space="preserve"> </w:t>
@@ -3569,7 +3612,7 @@
         <w:t xml:space="preserve"> </w:t>
       </w:r>
       <w:r>
-        <w:t xml:space="preserve">the metric code against cases worked out by hand and against scikit-learn — this caught a real bug in my first COCO-style AP;</w:t>
+        <w:t xml:space="preserve">The metric code against cases worked out by hand and against scikit-learn — this caught a genuine bug in my first COCO-style AP.</w:t>
       </w:r>
       <w:r>
         <w:t xml:space="preserve"> </w:t>
@@ -3585,7 +3628,7 @@
         <w:t xml:space="preserve"> </w:t>
       </w:r>
       <w:r>
-        <w:t xml:space="preserve">our mAP against the independent Ultralytics validator: 0.547 vs 0.542 (block) and 0.344 vs 0.338 (predefined) for the pretrained model;</w:t>
+        <w:t xml:space="preserve">My mAP against the independent Ultralytics validator: 0.547 vs 0.542 (block) and 0.344 vs 0.338 (predefined) for the pretrained model.</w:t>
       </w:r>
       <w:r>
         <w:t xml:space="preserve"> </w:t>
@@ -3601,7 +3644,7 @@
         <w:t xml:space="preserve"> </w:t>
       </w:r>
       <w:r>
-        <w:t xml:space="preserve">the data loaders by YOLO↔COCO round trip and a planted cross-split duplicate;</w:t>
+        <w:t xml:space="preserve">The data loaders, via a YOLO↔COCO round trip and a deliberately planted cross-split duplicate.</w:t>
       </w:r>
       <w:r>
         <w:t xml:space="preserve"> </w:t>
@@ -3617,7 +3660,7 @@
         <w:t xml:space="preserve"> </w:t>
       </w:r>
       <w:r>
-        <w:t xml:space="preserve">the whole pipeline on the synthetic set with exact labels, where the detector reached mAP@0.5 = 0.978 and a perfect tray ROC — so the much lower real-data scores reflect the problem, not the code;</w:t>
+        <w:t xml:space="preserve">The whole pipeline on the synthetic set, where the detector reached mAP@0.5 = 0.978 and a perfect tray ROC — so the much lower real-data scores reflect the problem, not my code.</w:t>
       </w:r>
       <w:r>
         <w:t xml:space="preserve"> </w:t>
@@ -3633,7 +3676,7 @@
         <w:t xml:space="preserve"> </w:t>
       </w:r>
       <w:r>
-        <w:t xml:space="preserve">every unsupported-input case of Section 2.1. In total</w:t>
+        <w:t xml:space="preserve">Every unsupported-input case from Section 2.1. In total</w:t>
       </w:r>
       <w:r>
         <w:t xml:space="preserve"> </w:t>
@@ -3658,7 +3701,7 @@
         <w:t xml:space="preserve">results/test_report.html</w:t>
       </w:r>
       <w:r>
-        <w:t xml:space="preserve">) on Linux and on Windows.</w:t>
+        <w:t xml:space="preserve">), on Linux and on Windows.</w:t>
       </w:r>
     </w:p>
     <w:bookmarkEnd w:id="41"/>
@@ -3716,47 +3759,34 @@
         <w:t xml:space="preserve"> </w:t>
       </w:r>
       <w:r>
-        <w:t xml:space="preserve">(mAP@0.5:0.95 = 0.387; at a confidence of 0.25, precision/recall are 0.84/0.75 and 0.69/0.68 respectively). Validation mAP on the same classes (0.765) is close to test (0.783), so the choice of best epoch did not over-fit validation. The other three classes have one test box each on the block split (3–4 on the predefined split) and are</w:t>
-      </w:r>
-      <w:r>
-        <w:t xml:space="preserve"> </w:t>
-      </w:r>
+        <w:t xml:space="preserve">(mAP@0.5:0.95 = 0.387; at confidence 0.25, precision/recall are 0.84/0.75 and 0.69/0.68). Validation mAP on the same classes (0.765) sits close to test (0.783), so picking the best epoch on validation didn’t over-fit it. The other three classes have one test box each on the block split (3–4 on the predefined one), so I don’t report them — their APs jump between 0 and 1 on a single detection. Detection rate at the operating threshold is 0.80–0.92 in every defect-size bin from &lt; 0.2 % to &gt; 5 % of the image, apart from 0.5–1 % (0.62, n = 16) (</w:t>
+      </w:r>
+      <w:r>
+        <w:rPr>
+          <w:rStyle w:val="VerbatimChar"/>
+        </w:rPr>
+        <w:t xml:space="preserve">results/pork-rasher-block/figures/recall_vs_size.png</w:t>
+      </w:r>
+      <w:r>
+        <w:t xml:space="preserve">). Small defects aren’t being systematically missed.</w:t>
+      </w:r>
+    </w:p>
+    <w:p>
+      <w:pPr>
+        <w:pStyle w:val="BodyText"/>
+      </w:pPr>
       <w:r>
         <w:rPr>
           <w:bCs/>
           <w:b/>
         </w:rPr>
-        <w:t xml:space="preserve">not evaluated</w:t>
-      </w:r>
-      <w:r>
-        <w:t xml:space="preserve">; for the record, their APs swing between 0 and 1. Detection rate at the operating threshold is 0.80–0.92 in every defect-size bin from &lt; 0.2 % to &gt; 5 % of the image, except 0.5–1 % (0.62, n = 16) (</w:t>
-      </w:r>
-      <w:r>
-        <w:rPr>
-          <w:rStyle w:val="VerbatimChar"/>
-        </w:rPr>
-        <w:t xml:space="preserve">results/pork-rasher-block/figures/recall_vs_size.png</w:t>
-      </w:r>
-      <w:r>
-        <w:t xml:space="preserve">): small defects are not systematically missed.</w:t>
-      </w:r>
-    </w:p>
-    <w:p>
-      <w:pPr>
-        <w:pStyle w:val="BodyText"/>
-      </w:pPr>
-      <w:r>
-        <w:rPr>
-          <w:bCs/>
-          <w:b/>
-        </w:rPr>
         <w:t xml:space="preserve">Tray decision.</w:t>
       </w:r>
       <w:r>
         <w:t xml:space="preserve"> </w:t>
       </w:r>
       <w:r>
-        <w:t xml:space="preserve">With thresholds chosen on validation (</w:t>
+        <w:t xml:space="preserve">With the validation thresholds (</w:t>
       </w:r>
       <w:r>
         <w:rPr>
@@ -3791,7 +3821,7 @@
         <w:t xml:space="preserve"> </w:t>
       </w:r>
       <w:r>
-        <w:t xml:space="preserve">= 0.048) the detector misses 2 of 134 defective test trays (escape rate 1.5 %), sends 2.9 % to review — and fails 56 % of good trays. The thresholds are low because 95 % recall on validation requires them; the full trade-off is in Table 1.</w:t>
+        <w:t xml:space="preserve">= 0.048) the detector lets 2 of 134 defective test trays through (1.5 % escape), sends 2.9 % to review — and fails 56 % of good trays. The thresholds end up low because hitting 95 % recall on validation demands it; Table 1 shows the whole trade-off.</w:t>
       </w:r>
     </w:p>
     <w:p>
@@ -3858,13 +3888,13 @@
           <w:bCs/>
           <w:b/>
         </w:rPr>
-        <w:t xml:space="preserve">Error analysis</w:t>
-      </w:r>
-      <w:r>
-        <w:t xml:space="preserve"> </w:t>
-      </w:r>
-      <w:r>
-        <w:t xml:space="preserve">(figure above; green = label, red = prediction).</w:t>
+        <w:t xml:space="preserve">Where it goes wrong</w:t>
+      </w:r>
+      <w:r>
+        <w:t xml:space="preserve"> </w:t>
+      </w:r>
+      <w:r>
+        <w:t xml:space="preserve">(green = label, red = prediction). The</w:t>
       </w:r>
       <w:r>
         <w:t xml:space="preserve"> </w:t>
@@ -3874,13 +3904,13 @@
           <w:iCs/>
           <w:i/>
         </w:rPr>
-        <w:t xml:space="preserve">Missed</w:t>
-      </w:r>
-      <w:r>
-        <w:t xml:space="preserve"> </w:t>
-      </w:r>
-      <w:r>
-        <w:t xml:space="preserve">defective trays carry very small</w:t>
+        <w:t xml:space="preserve">missed</w:t>
+      </w:r>
+      <w:r>
+        <w:t xml:space="preserve"> </w:t>
+      </w:r>
+      <w:r>
+        <w:t xml:space="preserve">trays have tiny</w:t>
       </w:r>
       <w:r>
         <w:t xml:space="preserve"> </w:t>
@@ -3895,7 +3925,7 @@
         <w:t xml:space="preserve"> </w:t>
       </w:r>
       <w:r>
-        <w:t xml:space="preserve">boxes at the image border or on a tray that is only partly in view.</w:t>
+        <w:t xml:space="preserve">boxes right at the image edge or on a tray only partly in view. The</w:t>
       </w:r>
       <w:r>
         <w:t xml:space="preserve"> </w:t>
@@ -3905,13 +3935,13 @@
           <w:iCs/>
           <w:i/>
         </w:rPr>
-        <w:t xml:space="preserve">False rejects</w:t>
-      </w:r>
-      <w:r>
-        <w:t xml:space="preserve"> </w:t>
-      </w:r>
-      <w:r>
-        <w:t xml:space="preserve">are almost all trays entering the frame from the right: the model reports a</w:t>
+        <w:t xml:space="preserve">false rejects</w:t>
+      </w:r>
+      <w:r>
+        <w:t xml:space="preserve"> </w:t>
+      </w:r>
+      <w:r>
+        <w:t xml:space="preserve">are nearly all trays sliding in from the right: the model flags a</w:t>
       </w:r>
       <w:r>
         <w:t xml:space="preserve"> </w:t>
@@ -3926,7 +3956,7 @@
         <w:t xml:space="preserve"> </w:t>
       </w:r>
       <w:r>
-        <w:t xml:space="preserve">on the visible film edge of a tray whose defect, if any, has not yet entered the frame — or which the annotator did not label in that frame. This points at a modelling limitation rather than a detector failure: the</w:t>
+        <w:t xml:space="preserve">on the visible film edge of a tray whose defect, if it has one, hasn’t entered the frame yet — or that the annotator didn’t label in that particular frame. This isn’t really the detector failing. It’s a modelling problem: a</w:t>
       </w:r>
       <w:r>
         <w:t xml:space="preserve"> </w:t>
@@ -3942,7 +3972,7 @@
         <w:t xml:space="preserve"> </w:t>
       </w:r>
       <w:r>
-        <w:t xml:space="preserve">is not the</w:t>
+        <w:t xml:space="preserve">is not a</w:t>
       </w:r>
       <w:r>
         <w:t xml:space="preserve"> </w:t>
@@ -3955,7 +3985,7 @@
         <w:t xml:space="preserve">tray</w:t>
       </w:r>
       <w:r>
-        <w:t xml:space="preserve">. A tray is seen in several consecutive frames, and the decision should be made once per tray from all of them (Section 7).</w:t>
+        <w:t xml:space="preserve">. Each tray appears in several consecutive frames, and the decision should be made once per tray, using all of them (Section 7).</w:t>
       </w:r>
     </w:p>
     <w:bookmarkEnd w:id="45"/>
@@ -4199,7 +4229,53 @@
         <w:pStyle w:val="BodyText"/>
       </w:pPr>
       <w:r>
-        <w:t xml:space="preserve">The tray-level picture moved in the expected direction: on genuinely unseen trays the decision is clearly worse, and the predefined split’s false-reject estimate (1 of 12 good trays) would have badly overstated what the plant could expect. Detection AP did</w:t>
+        <w:t xml:space="preserve">At tray level things moved the way I expected: on trays the model has never seen, the decision is clearly worse, and the predefined split’s false-reject estimate (1 of 12 good trays) would have badly oversold the system to a plant. Detection AP, on the other hand, went</w:t>
+      </w:r>
+      <w:r>
+        <w:t xml:space="preserve"> </w:t>
+      </w:r>
+      <w:r>
+        <w:rPr>
+          <w:iCs/>
+          <w:i/>
+        </w:rPr>
+        <w:t xml:space="preserve">up</w:t>
+      </w:r>
+      <w:r>
+        <w:t xml:space="preserve">. I didn’t see that coming. Two effects are tangled together and this data can’t separate them: the block test set is made up differently (98</w:t>
+      </w:r>
+      <w:r>
+        <w:t xml:space="preserve"> </w:t>
+      </w:r>
+      <w:r>
+        <w:rPr>
+          <w:rStyle w:val="VerbatimChar"/>
+        </w:rPr>
+        <w:t xml:space="preserve">packaging-error</w:t>
+      </w:r>
+      <w:r>
+        <w:t xml:space="preserve"> </w:t>
+      </w:r>
+      <w:r>
+        <w:t xml:space="preserve">boxes against 23, mostly from busy stretches of video the model learns well), and the predefined test set is so small that its AP swings by a lot on one or two detections. So the honest conclusion is narrower than</w:t>
+      </w:r>
+      <w:r>
+        <w:t xml:space="preserve"> </w:t>
+      </w:r>
+      <w:r>
+        <w:t xml:space="preserve">“</w:t>
+      </w:r>
+      <w:r>
+        <w:t xml:space="preserve">the predefined split inflates everything.</w:t>
+      </w:r>
+      <w:r>
+        <w:t xml:space="preserve">”</w:t>
+      </w:r>
+      <w:r>
+        <w:t xml:space="preserve"> </w:t>
+      </w:r>
+      <w:r>
+        <w:t xml:space="preserve">It is this:</w:t>
       </w:r>
       <w:r>
         <w:t xml:space="preserve"> </w:t>
@@ -4209,56 +4285,10 @@
           <w:bCs/>
           <w:b/>
         </w:rPr>
-        <w:t xml:space="preserve">not</w:t>
-      </w:r>
-      <w:r>
-        <w:t xml:space="preserve"> </w:t>
-      </w:r>
-      <w:r>
-        <w:t xml:space="preserve">fall — it rose — which I did not expect. Two effects are mixed here and cannot be separated with this data: the block test set has a different composition (98 vs 23</w:t>
-      </w:r>
-      <w:r>
-        <w:t xml:space="preserve"> </w:t>
-      </w:r>
-      <w:r>
-        <w:rPr>
-          <w:rStyle w:val="VerbatimChar"/>
-        </w:rPr>
-        <w:t xml:space="preserve">packaging-error</w:t>
-      </w:r>
-      <w:r>
-        <w:t xml:space="preserve"> </w:t>
-      </w:r>
-      <w:r>
-        <w:t xml:space="preserve">boxes, mostly in well-populated stretches of video that the model learns well), and the predefined test set is so small that its AP has large uncertainty (± one or two detections on 23 boxes). The honest conclusion is therefore narrower than</w:t>
-      </w:r>
-      <w:r>
-        <w:t xml:space="preserve"> </w:t>
-      </w:r>
-      <w:r>
-        <w:t xml:space="preserve">“</w:t>
-      </w:r>
-      <w:r>
-        <w:t xml:space="preserve">the predefined split inflates everything</w:t>
-      </w:r>
-      <w:r>
-        <w:t xml:space="preserve">”</w:t>
-      </w:r>
-      <w:r>
-        <w:t xml:space="preserve">:</w:t>
-      </w:r>
-      <w:r>
-        <w:t xml:space="preserve"> </w:t>
-      </w:r>
-      <w:r>
-        <w:rPr>
-          <w:bCs/>
-          <w:b/>
-        </w:rPr>
-        <w:t xml:space="preserve">the predefined split cannot be used to estimate the false-reject rate</w:t>
-      </w:r>
-      <w:r>
-        <w:t xml:space="preserve">, because it has too few good trays and those it has are near-copies of training frames; the block split, with 3× more good trays from unseen stretches, is the estimate an engineer should use.</w:t>
+        <w:t xml:space="preserve">the predefined split can’t be used to estimate the false-reject rate</w:t>
+      </w:r>
+      <w:r>
+        <w:t xml:space="preserve">, because it has too few good trays and those it does have are near-copies of training frames. The block split, with three times as many good trays from unseen stretches of video, is the number an engineer should use.</w:t>
       </w:r>
     </w:p>
     <w:bookmarkEnd w:id="46"/>
@@ -4280,7 +4310,7 @@
         <w:pStyle w:val="Compact"/>
       </w:pPr>
       <w:r>
-        <w:t xml:space="preserve">Performance on</w:t>
+        <w:t xml:space="preserve">How it does on</w:t>
       </w:r>
       <w:r>
         <w:t xml:space="preserve"> </w:t>
@@ -4319,7 +4349,7 @@
         <w:t xml:space="preserve">twisted-meat</w:t>
       </w:r>
       <w:r>
-        <w:t xml:space="preserve">. With 0–4 test boxes each, any AP for these classes is anecdotal. The tray decision includes them, but its recall is dominated by</w:t>
+        <w:t xml:space="preserve">. With 0–4 test boxes each, any AP is an anecdote. The tray decision does include them, but its recall is dominated by</w:t>
       </w:r>
       <w:r>
         <w:t xml:space="preserve"> </w:t>
@@ -4358,7 +4388,7 @@
         <w:pStyle w:val="Compact"/>
       </w:pPr>
       <w:r>
-        <w:t xml:space="preserve">Performance on other days, shifts, camera positions, lighting, trays or products. All frames appear to come from a single video session. Even the block split only separates moments within one session.</w:t>
+        <w:t xml:space="preserve">How it does on another day, shift, camera position, lighting, tray or product. Every frame seems to come from one recording session; even the block split only separates moments within it.</w:t>
       </w:r>
     </w:p>
     <w:p>
@@ -4370,7 +4400,7 @@
         <w:pStyle w:val="Compact"/>
       </w:pPr>
       <w:r>
-        <w:t xml:space="preserve">Whether the labels are correct. Some test boxes look ambiguous (for example, what counts as</w:t>
+        <w:t xml:space="preserve">Whether the labels are right. Some test boxes look debatable (where does</w:t>
       </w:r>
       <w:r>
         <w:t xml:space="preserve"> </w:t>
@@ -4385,7 +4415,7 @@
         <w:t xml:space="preserve"> </w:t>
       </w:r>
       <w:r>
-        <w:t xml:space="preserve">versus</w:t>
+        <w:t xml:space="preserve">end and</w:t>
       </w:r>
       <w:r>
         <w:t xml:space="preserve"> </w:t>
@@ -4397,7 +4427,10 @@
         <w:t xml:space="preserve">unsealed</w:t>
       </w:r>
       <w:r>
-        <w:t xml:space="preserve">), and nobody re-annotated them independently.</w:t>
+        <w:t xml:space="preserve"> </w:t>
+      </w:r>
+      <w:r>
+        <w:t xml:space="preserve">begin?), and nobody re-labelled them independently.</w:t>
       </w:r>
     </w:p>
     <w:p>
@@ -4409,7 +4442,7 @@
         <w:pStyle w:val="Compact"/>
       </w:pPr>
       <w:r>
-        <w:t xml:space="preserve">Physical seal integrity: the system only ever sees what the camera sees.</w:t>
+        <w:t xml:space="preserve">Whether the seal actually holds. The system only knows what the camera sees.</w:t>
       </w:r>
     </w:p>
     <w:bookmarkEnd w:id="47"/>
@@ -4423,13 +4456,13 @@
         <w:t xml:space="preserve">6. Optimisation and performance</w:t>
       </w:r>
     </w:p>
-    <w:bookmarkStart w:id="49" w:name="is-it-fast-enough-real-time-requirement"/>
+    <w:bookmarkStart w:id="49" w:name="is-it-fast-enough"/>
     <w:p>
       <w:pPr>
         <w:pStyle w:val="Heading3"/>
       </w:pPr>
       <w:r>
-        <w:t xml:space="preserve">6.1 Is it fast enough? (real-time requirement)</w:t>
+        <w:t xml:space="preserve">6.1 Is it fast enough?</w:t>
       </w:r>
     </w:p>
     <w:p>
@@ -4437,7 +4470,7 @@
         <w:pStyle w:val="FirstParagraph"/>
       </w:pPr>
       <w:r>
-        <w:t xml:space="preserve">A line packing 60 trays/min leaves</w:t>
+        <w:t xml:space="preserve">A line packing 60 trays a minute gives</w:t>
       </w:r>
       <w:r>
         <w:t xml:space="preserve"> </w:t>
@@ -4450,7 +4483,7 @@
         <w:t xml:space="preserve">1,000 ms per tray</w:t>
       </w:r>
       <w:r>
-        <w:t xml:space="preserve">. All timings are single-image, end-to-end (pre-processing, inference, NMS), measured after warm-up.</w:t>
+        <w:t xml:space="preserve">. All timings below are single-image, end to end (pre-processing, inference, NMS), measured after a warm-up.</w:t>
       </w:r>
     </w:p>
     <w:tbl>
@@ -4710,7 +4743,7 @@
               <w:jc w:val="left"/>
             </w:pPr>
             <w:r>
-              <w:t xml:space="preserve">GFLOPs per image (our counter)</w:t>
+              <w:t xml:space="preserve">GFLOPs per image (my counter)</w:t>
             </w:r>
           </w:p>
         </w:tc>
@@ -4867,13 +4900,13 @@
           <w:bCs/>
           <w:b/>
         </w:rPr>
-        <w:t xml:space="preserve">Yes, on a CPU alone, with a margin of about 12× at p95.</w:t>
-      </w:r>
-      <w:r>
-        <w:t xml:space="preserve"> </w:t>
-      </w:r>
-      <w:r>
-        <w:t xml:space="preserve">A GPU is not needed for this line rate. The classical baseline (385 ms/tray) would also fit, but is not accurate enough. 416 px is selected: it is the most accurate resolution, and 640 px is both 1.7× slower and</w:t>
+        <w:t xml:space="preserve">Yes — on a CPU alone, with about 12× headroom at p95.</w:t>
+      </w:r>
+      <w:r>
+        <w:t xml:space="preserve"> </w:t>
+      </w:r>
+      <w:r>
+        <w:t xml:space="preserve">No GPU needed at this line rate. The baseline (385 ms per tray) would also fit, it’s just not accurate enough. I kept 416 px: it’s the most accurate setting, and 640 px is both 1.7× slower and</w:t>
       </w:r>
       <w:r>
         <w:t xml:space="preserve"> </w:t>
@@ -4889,7 +4922,7 @@
         <w:t xml:space="preserve"> </w:t>
       </w:r>
       <w:r>
-        <w:t xml:space="preserve">accurate — most likely because the model was trained at 416 px and objects then appear at an unfamiliar scale. GPU timings at batch 1 are dominated by fixed per-call overhead rather than arithmetic and were erratic between runs on the laptop (≈ 9 ms in the final run, 30–40 ms in an earlier one under different power state), so CPU figures are the dependable basis for the requirement. Batching raises GPU throughput from 25 to 94 images/s (batch 1 → 16) — useful for offline re-inspection, irrelevant on a line that delivers one tray at a time. Peak process memory was 1.8 GB (dominated by the PyTorch/CUDA runtime; the weights are 6.5 MB).</w:t>
+        <w:t xml:space="preserve">accurate, most likely because the model was trained at 416 px and objects then appear at a scale it hasn’t seen. The GPU numbers at batch 1 are mostly fixed per-call overhead rather than arithmetic, and they bounced around between runs on my laptop (about 9 ms in the final run, 30–40 ms in an earlier one, presumably a different power state). So I base the requirement on the CPU numbers. Batching does lift GPU throughput from 25 to 94 images per second (batch 1 → 16) — nice for re-checking a day’s footage offline, irrelevant on a line that hands you one tray at a time. Peak memory was 1.8 GB, almost all PyTorch/CUDA runtime; the weights themselves are 6.5 MB.</w:t>
       </w:r>
     </w:p>
     <w:bookmarkEnd w:id="49"/>
@@ -4907,7 +4940,7 @@
         <w:pStyle w:val="FirstParagraph"/>
       </w:pPr>
       <w:r>
-        <w:t xml:space="preserve">The FLOP count was computed layer by layer with forward hooks: for each convolution, FLOPs = 2·C</w:t>
+        <w:t xml:space="preserve">I counted FLOPs layer by layer with forward hooks. For each convolution, FLOPs = 2·C</w:t>
       </w:r>
       <w:r>
         <w:t xml:space="preserve">out</w:t>
@@ -4943,7 +4976,7 @@
         <w:t xml:space="preserve">w</w:t>
       </w:r>
       <w:r>
-        <w:t xml:space="preserve">, and bytes = 4·(|input| + |weights| + |output|) for float32. The counter was verified by a hand calculation in a unit test and agrees with the independent</w:t>
+        <w:t xml:space="preserve">, and bytes = 4·(|input| + |weights| + |output|) for float32. The counter passes a hand-calculated unit test and agrees with the independent</w:t>
       </w:r>
       <w:r>
         <w:t xml:space="preserve"> </w:t>
@@ -4958,7 +4991,7 @@
         <w:t xml:space="preserve"> </w:t>
       </w:r>
       <w:r>
-        <w:t xml:space="preserve">counter (2.81 vs 2.85 GFLOPs at 416 × 320; the difference is non-convolution layers that</w:t>
+        <w:t xml:space="preserve">counter (2.81 vs 2.85 GFLOPs at 416 × 320;</w:t>
       </w:r>
       <w:r>
         <w:t xml:space="preserve"> </w:t>
@@ -4973,7 +5006,7 @@
         <w:t xml:space="preserve"> </w:t>
       </w:r>
       <w:r>
-        <w:t xml:space="preserve">also counts). The 64 convolutions have an arithmetic intensity between 0.5 and 153 FLOP/byte, 48 FLOP/byte for the network as a whole.</w:t>
+        <w:t xml:space="preserve">also counts a few non-convolution layers). The 64 convolutions range from 0.5 to 153 FLOP/byte in arithmetic intensity, 48 FLOP/byte for the network as a whole.</w:t>
       </w:r>
     </w:p>
     <w:p>
@@ -5036,7 +5069,7 @@
         <w:pStyle w:val="BodyText"/>
       </w:pPr>
       <w:r>
-        <w:t xml:space="preserve">Measured on the laptop CPU, the attainable compute rate (large matrix multiply) is 274 GFLOP/s and the copy bandwidth 19 GB/s, so the ridge point is ≈ 14 FLOP/byte. Most layers, and the network as a whole, lie to its right: the roofline says the model is</w:t>
+        <w:t xml:space="preserve">On my laptop’s CPU the attainable compute rate (a large matrix multiply) measured 274 GFLOP/s and the copy bandwidth 19 GB/s, putting the ridge point at about 14 FLOP/byte. Most layers, and the network overall, sit to the right of it. The roofline therefore says the model is</w:t>
       </w:r>
       <w:r>
         <w:t xml:space="preserve"> </w:t>
@@ -5052,7 +5085,7 @@
         <w:t xml:space="preserve"> </w:t>
       </w:r>
       <w:r>
-        <w:t xml:space="preserve">on this CPU and could at best run at ≈ 274 GFLOP/s, i.e. ≈ 10 ms per image. It actually attains</w:t>
+        <w:t xml:space="preserve">here and could at best run at about 274 GFLOP/s — roughly 10 ms per image. It actually manages</w:t>
       </w:r>
       <w:r>
         <w:t xml:space="preserve"> </w:t>
@@ -5065,17 +5098,17 @@
         <w:t xml:space="preserve">47 GFLOP/s (17 % of peak; 59 ms inference)</w:t>
       </w:r>
       <w:r>
-        <w:t xml:space="preserve">. The gap is therefore not memory bandwidth but the efficiency of many small convolutions (short inner loops, im2col/re-layout overhead, thread synchronisation per layer) — consistent with the thread-scaling measurement, where one thread (55 ms) was faster than 14 (66 ms) on this hybrid P-/E-core CPU. Credible next steps are therefore operator-level, not algorithmic: an inference runtime that fuses layers (ONNX Runtime / OpenVINO), or int8 quantisation (≈ 4× fewer bytes and faster integer kernels). The same hardware micro-benchmarks gave 97 GFLOP/s and 4 GB/s in an earlier run on the same laptop — a reminder that laptop power management makes single timing runs unreliable, and that the requirement margin, not the third digit, is what matters.</w:t>
+        <w:t xml:space="preserve">. So the gap isn’t memory bandwidth; it’s how inefficiently a CPU runs lots of small convolutions (short inner loops, data re-layout, thread synchronisation at every layer). The thread-scaling test points the same way: one thread (55 ms) beat fourteen (66 ms) on this hybrid P-/E-core chip. The sensible next steps are about how the operations are executed, not the algorithm: a runtime that fuses layers (ONNX Runtime or OpenVINO), or int8 quantisation (about 4× fewer bytes and faster integer kernels). One cautionary note: the same micro-benchmarks gave 97 GFLOP/s and 4 GB/s in an earlier run on the same laptop. Laptop power management makes any single timing run unreliable, which is why I lean on the 12× margin rather than the third significant figure.</w:t>
       </w:r>
     </w:p>
     <w:bookmarkEnd w:id="53"/>
-    <w:bookmarkStart w:id="54" w:name="optimising-the-baseline-profiling"/>
+    <w:bookmarkStart w:id="54" w:name="speeding-up-the-baseline-profiling"/>
     <w:p>
       <w:pPr>
         <w:pStyle w:val="Heading3"/>
       </w:pPr>
       <w:r>
-        <w:t xml:space="preserve">6.3 Optimising the baseline (profiling)</w:t>
+        <w:t xml:space="preserve">6.3 Speeding up the baseline (profiling)</w:t>
       </w:r>
     </w:p>
     <w:p>
@@ -5083,16 +5116,16 @@
         <w:pStyle w:val="FirstParagraph"/>
       </w:pPr>
       <w:r>
-        <w:t xml:space="preserve">Profiling (</w:t>
-      </w:r>
-      <w:r>
         <w:rPr>
           <w:rStyle w:val="VerbatimChar"/>
         </w:rPr>
         <w:t xml:space="preserve">cProfile</w:t>
       </w:r>
       <w:r>
-        <w:t xml:space="preserve">) showed four functions taking 64 % of the baseline’s time; sharing colour conversions, a smaller morphological footprint and a 32-level GLCM made feature extraction</w:t>
+        <w:t xml:space="preserve"> </w:t>
+      </w:r>
+      <w:r>
+        <w:t xml:space="preserve">showed four functions eating 64 % of the baseline’s time. Computing each colour conversion once instead of three times, using a smaller morphological footprint, and quantising the GLCM to 32 grey levels made feature extraction</w:t>
       </w:r>
       <w:r>
         <w:t xml:space="preserve"> </w:t>
@@ -5105,7 +5138,7 @@
         <w:t xml:space="preserve">1.9× faster (409 → 214 ms per image)</w:t>
       </w:r>
       <w:r>
-        <w:t xml:space="preserve">, reproducibly on both machines, with a test guaranteeing unchanged features where nothing was meant to change (Appendix B).</w:t>
+        <w:t xml:space="preserve">, and the gain reproduced on both machines. A test makes sure every feature I didn’t mean to change stays bit-identical (Appendix B).</w:t>
       </w:r>
     </w:p>
     <w:bookmarkEnd w:id="54"/>
@@ -5178,7 +5211,7 @@
         <w:pStyle w:val="BodyText"/>
       </w:pPr>
       <w:r>
-        <w:t xml:space="preserve">Each perturbation was applied to every test image, with the validation thresholds kept fixed. For the pretrained detector on the block split:</w:t>
+        <w:t xml:space="preserve">I applied each perturbation to every test image and kept the validation thresholds fixed. For the pretrained detector on the block split:</w:t>
       </w:r>
     </w:p>
     <w:p>
@@ -5194,13 +5227,13 @@
           <w:bCs/>
           <w:b/>
         </w:rPr>
-        <w:t xml:space="preserve">Not sensitive:</w:t>
-      </w:r>
-      <w:r>
-        <w:t xml:space="preserve"> </w:t>
-      </w:r>
-      <w:r>
-        <w:t xml:space="preserve">exposure ×0.5–×1.6 (recall 0.97–0.98, false-reject 0.44–0.59), synthetic glare up to strength 0.8, JPEG down to quality 15. Training-time HSV augmentation covers these.</w:t>
+        <w:t xml:space="preserve">Shrugs it off:</w:t>
+      </w:r>
+      <w:r>
+        <w:t xml:space="preserve"> </w:t>
+      </w:r>
+      <w:r>
+        <w:t xml:space="preserve">exposure ×0.5–×1.6 (recall 0.97–0.98, false-reject 0.44–0.59), synthetic glare up to strength 0.8, JPEG down to quality 15. The HSV augmentation during training covers these.</w:t>
       </w:r>
     </w:p>
     <w:p>
@@ -5216,7 +5249,7 @@
           <w:bCs/>
           <w:b/>
         </w:rPr>
-        <w:t xml:space="preserve">Sensitive:</w:t>
+        <w:t xml:space="preserve">Hurts:</w:t>
       </w:r>
       <w:r>
         <w:t xml:space="preserve"> </w:t>
@@ -5232,7 +5265,7 @@
         <w:t xml:space="preserve"> </w:t>
       </w:r>
       <w:r>
-        <w:t xml:space="preserve">— at σ = 3 px recall falls from 0.98 to 0.88 and mAP from 0.55 to 0.22;</w:t>
+        <w:t xml:space="preserve">— at σ = 3 px recall drops from 0.98 to 0.88 and mAP from 0.55 to 0.22;</w:t>
       </w:r>
       <w:r>
         <w:t xml:space="preserve"> </w:t>
@@ -5242,13 +5275,13 @@
           <w:iCs/>
           <w:i/>
         </w:rPr>
-        <w:t xml:space="preserve">loss of colour</w:t>
-      </w:r>
-      <w:r>
-        <w:t xml:space="preserve"> </w:t>
-      </w:r>
-      <w:r>
-        <w:t xml:space="preserve">— at zero saturation false rejects rise to 95 %; heavy</w:t>
+        <w:t xml:space="preserve">losing colour</w:t>
+      </w:r>
+      <w:r>
+        <w:t xml:space="preserve"> </w:t>
+      </w:r>
+      <w:r>
+        <w:t xml:space="preserve">— at zero saturation false rejects shoot up to 95 %; heavy</w:t>
       </w:r>
       <w:r>
         <w:t xml:space="preserve"> </w:t>
@@ -5264,7 +5297,7 @@
         <w:t xml:space="preserve"> </w:t>
       </w:r>
       <w:r>
-        <w:t xml:space="preserve">(σ = 35 grey levels) suppresses detections (recall 0.75). On the predefined split the same pattern held (blur σ = 3 px: false rejects 8 % → 58 %).</w:t>
+        <w:t xml:space="preserve">(σ = 35 grey levels) suppresses detections (recall 0.75). The predefined split showed the same pattern (blur σ = 3 px: false rejects 8 % → 58 %).</w:t>
       </w:r>
     </w:p>
     <w:p>
@@ -5276,7 +5309,7 @@
         <w:pStyle w:val="Compact"/>
       </w:pPr>
       <w:r>
-        <w:t xml:space="preserve">The scratch model and especially the random forest are much more fragile: the forest fails almost every good tray under any perturbation.</w:t>
+        <w:t xml:space="preserve">The scratch model, and the random forest even more so, are far more fragile; the forest fails almost every good tray under any perturbation.</w:t>
       </w:r>
     </w:p>
     <w:p>
@@ -5284,7 +5317,7 @@
         <w:pStyle w:val="FirstParagraph"/>
       </w:pPr>
       <w:r>
-        <w:t xml:space="preserve">Engineering consequence: the camera’s</w:t>
+        <w:t xml:space="preserve">The practical upshot: someone has to</w:t>
       </w:r>
       <w:r>
         <w:t xml:space="preserve"> </w:t>
@@ -5294,49 +5327,10 @@
           <w:bCs/>
           <w:b/>
         </w:rPr>
-        <w:t xml:space="preserve">focus and white balance must be monitored</w:t>
-      </w:r>
-      <w:r>
-        <w:t xml:space="preserve"> </w:t>
-      </w:r>
-      <w:r>
-        <w:t xml:space="preserve">— a defocused or colour-shifted camera silently converts the system into a</w:t>
-      </w:r>
-      <w:r>
-        <w:t xml:space="preserve"> </w:t>
-      </w:r>
-      <w:r>
-        <w:t xml:space="preserve">“</w:t>
-      </w:r>
-      <w:r>
-        <w:t xml:space="preserve">fail everything</w:t>
-      </w:r>
-      <w:r>
-        <w:t xml:space="preserve">”</w:t>
-      </w:r>
-      <w:r>
-        <w:t xml:space="preserve"> </w:t>
-      </w:r>
-      <w:r>
-        <w:t xml:space="preserve">or</w:t>
-      </w:r>
-      <w:r>
-        <w:t xml:space="preserve"> </w:t>
-      </w:r>
-      <w:r>
-        <w:t xml:space="preserve">“</w:t>
-      </w:r>
-      <w:r>
-        <w:t xml:space="preserve">miss things</w:t>
-      </w:r>
-      <w:r>
-        <w:t xml:space="preserve">”</w:t>
-      </w:r>
-      <w:r>
-        <w:t xml:space="preserve"> </w:t>
-      </w:r>
-      <w:r>
-        <w:t xml:space="preserve">machine. A cheap guard is to add a focus measure (variance of the Laplacian) and a colour check to the input validation, so that such images become</w:t>
+        <w:t xml:space="preserve">keep an eye on the camera’s focus and white balance</w:t>
+      </w:r>
+      <w:r>
+        <w:t xml:space="preserve">. A slightly soft or colour-shifted camera quietly turns this into a fail-everything or miss-things machine. A cheap fix is to add a focus measure (variance of the Laplacian) and a colour check to the input validation, so those images come back as</w:t>
       </w:r>
       <w:r>
         <w:t xml:space="preserve"> </w:t>
@@ -5374,7 +5368,7 @@
           <w:bCs/>
           <w:b/>
         </w:rPr>
-        <w:t xml:space="preserve">Principal limitations.</w:t>
+        <w:t xml:space="preserve">Main limitations.</w:t>
       </w:r>
     </w:p>
     <w:p>
@@ -5390,13 +5384,13 @@
           <w:iCs/>
           <w:i/>
         </w:rPr>
-        <w:t xml:space="preserve">Data, not the method, limits the conclusions.</w:t>
-      </w:r>
-      <w:r>
-        <w:t xml:space="preserve"> </w:t>
-      </w:r>
-      <w:r>
-        <w:t xml:space="preserve">Three of five defect classes have 1–4 test boxes; their performance is unknown. Only</w:t>
+        <w:t xml:space="preserve">The data, not the method, limits what I can claim.</w:t>
+      </w:r>
+      <w:r>
+        <w:t xml:space="preserve"> </w:t>
+      </w:r>
+      <w:r>
+        <w:t xml:space="preserve">Three of the five defect classes have 1–4 test boxes, so their performance is simply unknown. Only</w:t>
       </w:r>
       <w:r>
         <w:t xml:space="preserve"> </w:t>
@@ -5448,7 +5442,7 @@
         <w:t xml:space="preserve"> </w:t>
       </w:r>
       <w:r>
-        <w:t xml:space="preserve">Even the block split only separates moments of one video; lighting, belt, trays and product are the same throughout. Performance on another day or line is not established.</w:t>
+        <w:t xml:space="preserve">The block split only separates moments of one video; lighting, belt, trays and product never change. Another day or another line is untested.</w:t>
       </w:r>
     </w:p>
     <w:p>
@@ -5464,13 +5458,13 @@
           <w:iCs/>
           <w:i/>
         </w:rPr>
-        <w:t xml:space="preserve">Frame ≠ tray.</w:t>
-      </w:r>
-      <w:r>
-        <w:t xml:space="preserve"> </w:t>
-      </w:r>
-      <w:r>
-        <w:t xml:space="preserve">Decisions are made per frame, but a tray is seen in many frames and a defect may only be visible in some of them. Most false rejects are trays half in view.</w:t>
+        <w:t xml:space="preserve">A frame is not a tray.</w:t>
+      </w:r>
+      <w:r>
+        <w:t xml:space="preserve"> </w:t>
+      </w:r>
+      <w:r>
+        <w:t xml:space="preserve">Decisions are per frame, but each tray shows up in many frames and a defect may only be visible in some. Most false rejects are trays half in view.</w:t>
       </w:r>
     </w:p>
     <w:p>
@@ -5486,13 +5480,13 @@
           <w:iCs/>
           <w:i/>
         </w:rPr>
-        <w:t xml:space="preserve">High false-reject rate at high recall</w:t>
-      </w:r>
-      <w:r>
-        <w:t xml:space="preserve"> </w:t>
-      </w:r>
-      <w:r>
-        <w:t xml:space="preserve">on unseen trays (≈ 41 % at 90 % recall).</w:t>
+        <w:t xml:space="preserve">Too many false rejects at high recall</w:t>
+      </w:r>
+      <w:r>
+        <w:t xml:space="preserve"> </w:t>
+      </w:r>
+      <w:r>
+        <w:t xml:space="preserve">on unseen trays (about 41 % at 90 % recall).</w:t>
       </w:r>
     </w:p>
     <w:p>
@@ -5504,7 +5498,7 @@
         <w:pStyle w:val="Compact"/>
       </w:pPr>
       <w:r>
-        <w:t xml:space="preserve">Labels were not independently checked; box area is only a severity proxy; seal integrity cannot be judged visually.</w:t>
+        <w:t xml:space="preserve">Labels weren’t independently checked; box area is only a rough severity measure; a camera can’t judge seal strength.</w:t>
       </w:r>
     </w:p>
     <w:p>
@@ -5532,13 +5526,13 @@
           <w:bCs/>
           <w:b/>
         </w:rPr>
-        <w:t xml:space="preserve">Audit the data before modelling.</w:t>
-      </w:r>
-      <w:r>
-        <w:t xml:space="preserve"> </w:t>
-      </w:r>
-      <w:r>
-        <w:t xml:space="preserve">The single most consequential finding of the project — that the predefined split is built from near-identical video frames — came from reading file names, not from any model. Without it the report would have claimed a 8 % false-reject rate instead of ≈ 41–56 %.</w:t>
+        <w:t xml:space="preserve">Look at the data before modelling it.</w:t>
+      </w:r>
+      <w:r>
+        <w:t xml:space="preserve"> </w:t>
+      </w:r>
+      <w:r>
+        <w:t xml:space="preserve">The biggest finding of the project — that the given split is built from near-identical video frames — came from reading file names, not from any model. Without it this report would be quoting an 8 % false-reject rate instead of 41–56 %.</w:t>
       </w:r>
     </w:p>
     <w:p>
@@ -5554,7 +5548,7 @@
           <w:bCs/>
           <w:b/>
         </w:rPr>
-        <w:t xml:space="preserve">Validate what the user acts on.</w:t>
+        <w:t xml:space="preserve">Validate what the user actually acts on.</w:t>
       </w:r>
       <w:r>
         <w:t xml:space="preserve"> </w:t>
@@ -5576,7 +5570,7 @@
         <w:t xml:space="preserve"> </w:t>
       </w:r>
       <w:r>
-        <w:t xml:space="preserve">than the predefined one; the tray-level metrics show the opposite. The decision metric and its uncertainty (bootstrap CIs on 12 vs 39 good trays) are what an engineer can use.</w:t>
+        <w:t xml:space="preserve">than the predefined one. The tray-level numbers say the opposite, and those — with their uncertainty, 12 good trays versus 39 — are what a plant can use.</w:t>
       </w:r>
     </w:p>
     <w:p>
@@ -5592,13 +5586,13 @@
           <w:bCs/>
           <w:b/>
         </w:rPr>
-        <w:t xml:space="preserve">Verification first, then validation.</w:t>
-      </w:r>
-      <w:r>
-        <w:t xml:space="preserve"> </w:t>
-      </w:r>
-      <w:r>
-        <w:t xml:space="preserve">Hand-calculated tests caught a real AP bug, and the synthetic set proved that the pipeline scores perfect labels perfectly, so poor real-data numbers could be attributed to the problem rather than the code. Cross-checking against an independent implementation (Ultralytics) gave agreement within 0.005–0.015 mAP.</w:t>
+        <w:t xml:space="preserve">Verify first, then validate.</w:t>
+      </w:r>
+      <w:r>
+        <w:t xml:space="preserve"> </w:t>
+      </w:r>
+      <w:r>
+        <w:t xml:space="preserve">Hand-calculated tests caught a real AP bug, and the synthetic set showed the pipeline scores perfect labels perfectly. That is what let me blame the poor real-data numbers on the problem rather than on my code. The independent cross-check with Ultralytics agreed within 0.005–0.015 mAP.</w:t>
       </w:r>
     </w:p>
     <w:p>
@@ -5614,13 +5608,25 @@
           <w:bCs/>
           <w:b/>
         </w:rPr>
-        <w:t xml:space="preserve">Measure on the target platform.</w:t>
-      </w:r>
-      <w:r>
-        <w:t xml:space="preserve"> </w:t>
-      </w:r>
-      <w:r>
-        <w:t xml:space="preserve">Three failures appeared only on Windows; GPU timings varied 4× between runs on the same laptop. Requirements should be judged with margins and percentiles, not single numbers.</w:t>
+        <w:t xml:space="preserve">Test on the machine you’ll actually use, early.</w:t>
+      </w:r>
+      <w:r>
+        <w:t xml:space="preserve"> </w:t>
+      </w:r>
+      <w:r>
+        <w:t xml:space="preserve">This one I learned the hard way. Everything ran cleanly in a Linux test environment, then broke three times on my Windows laptop. My default Python (3.15) was too new: PyTorch installed, but scikit-image had no ready-made build and wanted a C compiler I don’t have, so I installed Python 3.12 alongside it. Windows also runs worker processes differently, so data loading had to go single-process. And a timing step crashed outright because it used</w:t>
+      </w:r>
+      <w:r>
+        <w:t xml:space="preserve"> </w:t>
+      </w:r>
+      <w:r>
+        <w:rPr>
+          <w:rStyle w:val="VerbatimChar"/>
+        </w:rPr>
+        <w:t xml:space="preserve">resource</w:t>
+      </w:r>
+      <w:r>
+        <w:t xml:space="preserve">, a module that only exists on Linux and macOS. None of these showed up in 80 passing tests, because the tests never ran on Windows until the end. GPU timings also varied 4× between runs on the same laptop. Requirements should be judged against margins and percentiles, not one number from one run.</w:t>
       </w:r>
     </w:p>
     <w:p>
@@ -5636,13 +5642,13 @@
           <w:bCs/>
           <w:b/>
         </w:rPr>
-        <w:t xml:space="preserve">A simple, transparent baseline earns its place</w:t>
-      </w:r>
-      <w:r>
-        <w:t xml:space="preserve"> </w:t>
-      </w:r>
-      <w:r>
-        <w:t xml:space="preserve">even when it loses: its feature importances showed what a naive model latches onto (how much tray is in view) and quantified how much the detector actually adds.</w:t>
+        <w:t xml:space="preserve">A simple baseline earns its place, even when it loses.</w:t>
+      </w:r>
+      <w:r>
+        <w:t xml:space="preserve"> </w:t>
+      </w:r>
+      <w:r>
+        <w:t xml:space="preserve">Its feature importances showed what a naive model grabs onto (how much tray is in view), and it put a number on how much the detector actually adds.</w:t>
       </w:r>
     </w:p>
     <w:p>
@@ -5654,7 +5660,7 @@
           <w:bCs/>
           <w:b/>
         </w:rPr>
-        <w:t xml:space="preserve">Proposed improvements, in order of expected value.</w:t>
+        <w:t xml:space="preserve">What I’d improve next, most valuable first.</w:t>
       </w:r>
     </w:p>
     <w:p>
@@ -5670,10 +5676,13 @@
           <w:bCs/>
           <w:b/>
         </w:rPr>
-        <w:t xml:space="preserve">Decide per tray, not per frame</w:t>
-      </w:r>
-      <w:r>
-        <w:t xml:space="preserve">: track trays across frames (their motion along the belt is predictable) and fail a tray if a defect is seen consistently in ≥</w:t>
+        <w:t xml:space="preserve">Decide per tray, not per frame.</w:t>
+      </w:r>
+      <w:r>
+        <w:t xml:space="preserve"> </w:t>
+      </w:r>
+      <w:r>
+        <w:t xml:space="preserve">Track each tray across frames (it moves along the belt predictably) and fail it only if a defect shows up consistently in ≥</w:t>
       </w:r>
       <w:r>
         <w:t xml:space="preserve"> </w:t>
@@ -5689,7 +5698,7 @@
         <w:t xml:space="preserve"> </w:t>
       </w:r>
       <w:r>
-        <w:t xml:space="preserve">frames; this directly targets the dominant false-reject mode and can be validated with the existing data by grouping frames.</w:t>
+        <w:t xml:space="preserve">frames. This goes straight at the main source of false rejects, and it can be validated on the existing data by grouping frames.</w:t>
       </w:r>
     </w:p>
     <w:p>
@@ -5705,10 +5714,13 @@
           <w:bCs/>
           <w:b/>
         </w:rPr>
-        <w:t xml:space="preserve">More and independent data</w:t>
-      </w:r>
-      <w:r>
-        <w:t xml:space="preserve">: record further sessions (other days, lighting) and collect defect classes that are currently missing; re-annotate a sample to measure label noise.</w:t>
+        <w:t xml:space="preserve">More, and more independent, data.</w:t>
+      </w:r>
+      <w:r>
+        <w:t xml:space="preserve"> </w:t>
+      </w:r>
+      <w:r>
+        <w:t xml:space="preserve">Record other sessions (other days, other lighting), collect the defect classes that are currently missing, and re-label a sample to measure label noise.</w:t>
       </w:r>
     </w:p>
     <w:p>
@@ -5724,10 +5736,13 @@
           <w:bCs/>
           <w:b/>
         </w:rPr>
-        <w:t xml:space="preserve">Input guards</w:t>
-      </w:r>
-      <w:r>
-        <w:t xml:space="preserve">: focus (Laplacian variance) and colour checks before detection (Section 6.4).</w:t>
+        <w:t xml:space="preserve">Input guards.</w:t>
+      </w:r>
+      <w:r>
+        <w:t xml:space="preserve"> </w:t>
+      </w:r>
+      <w:r>
+        <w:t xml:space="preserve">Focus (Laplacian variance) and colour checks before detection (Section 6.4).</w:t>
       </w:r>
     </w:p>
     <w:p>
@@ -5743,10 +5758,13 @@
           <w:bCs/>
           <w:b/>
         </w:rPr>
-        <w:t xml:space="preserve">Model</w:t>
-      </w:r>
-      <w:r>
-        <w:t xml:space="preserve">: fine-tune at the deployment resolution with class-balanced sampling for rare classes; consider a slightly larger model (YOLOv8s), affordable given the 12× latency margin.</w:t>
+        <w:t xml:space="preserve">Model.</w:t>
+      </w:r>
+      <w:r>
+        <w:t xml:space="preserve"> </w:t>
+      </w:r>
+      <w:r>
+        <w:t xml:space="preserve">Fine-tune at the deployment resolution with class-balanced sampling for the rare classes; try a slightly larger model (YOLOv8s), which the 12× latency margin easily allows.</w:t>
       </w:r>
     </w:p>
     <w:p>
@@ -5762,10 +5780,13 @@
           <w:bCs/>
           <w:b/>
         </w:rPr>
-        <w:t xml:space="preserve">Deployment</w:t>
-      </w:r>
-      <w:r>
-        <w:t xml:space="preserve">: export to ONNX/OpenVINO with int8 quantisation, and re-select thresholds on site with the plant’s own cost of escapes vs re-checks.</w:t>
+        <w:t xml:space="preserve">Deployment.</w:t>
+      </w:r>
+      <w:r>
+        <w:t xml:space="preserve"> </w:t>
+      </w:r>
+      <w:r>
+        <w:t xml:space="preserve">Export to ONNX/OpenVINO with int8 quantisation, and re-pick the thresholds on site using the plant’s own costs for escapes and re-checks.</w:t>
       </w:r>
     </w:p>
     <w:bookmarkEnd w:id="60"/>
@@ -5793,7 +5814,7 @@
         <w:t xml:space="preserve"> </w:t>
       </w:r>
       <w:r>
-        <w:t xml:space="preserve">this section must describe my own use of AI honestly and in my own words. The facts below are taken from the project log; edit the evaluation to reflect what I actually checked and understood.</w:t>
+        <w:t xml:space="preserve">this section has to describe my own use of AI honestly and in my own words. The facts below come from the project log and commit history; I still need to edit the evaluation so it reflects what I actually checked and understood.</w:t>
       </w:r>
     </w:p>
     <w:p>
@@ -5805,13 +5826,13 @@
           <w:bCs/>
           <w:b/>
         </w:rPr>
-        <w:t xml:space="preserve">How AI was used.</w:t>
-      </w:r>
-      <w:r>
-        <w:t xml:space="preserve"> </w:t>
-      </w:r>
-      <w:r>
-        <w:t xml:space="preserve">Claude (Anthropic), used as an agentic assistant with access to a cloud workspace and, later, to my laptop’s project folder, wrote most of the code and tests, proposed the method and validation design, ran the CPU experiments and the synthetic verification, and drafted this report from the generated results. I selected the project, supplied the dataset, ran the GPU pipeline on my RTX 4070 laptop, reported errors back, and reviewed the outputs. The commit history records this split of the work; every commit made by the assistant is labelled as co-authored.</w:t>
+        <w:t xml:space="preserve">How I used it.</w:t>
+      </w:r>
+      <w:r>
+        <w:t xml:space="preserve"> </w:t>
+      </w:r>
+      <w:r>
+        <w:t xml:space="preserve">Claude (Anthropic), working as an agentic assistant with access to a cloud workspace and later to my laptop’s project folder, wrote most of the code and tests, proposed the method and validation design, ran the CPU experiments and the synthetic verification, and drafted this report from the generated results. I chose the project, supplied the dataset, ran the GPU pipeline on my RTX 4070 laptop, fed the errors back, and reviewed the outputs. The commit history shows the split: every commit made by the assistant is marked as co-authored.</w:t>
       </w:r>
     </w:p>
     <w:p>
@@ -5823,13 +5844,13 @@
           <w:bCs/>
           <w:b/>
         </w:rPr>
-        <w:t xml:space="preserve">Where the AI was wrong, and how it was caught.</w:t>
-      </w:r>
-      <w:r>
-        <w:t xml:space="preserve"> </w:t>
-      </w:r>
-      <w:r>
-        <w:t xml:space="preserve">Eight documented cases (Appendix C) fall into three groups: a numerical bug (the first AP implementation returned 0.0099 instead of 0 — caught by a hand-calculated test); environment assumptions that only failed on my Windows laptop (a Linux-only module, process start-up behaviour, Python-version support of PyTorch and scikit-image); and analysis slips that I caught when reviewing results (a roofline plot that mixed GPU timings with a CPU ceiling, a</w:t>
+        <w:t xml:space="preserve">Where it was wrong, and how that was caught.</w:t>
+      </w:r>
+      <w:r>
+        <w:t xml:space="preserve"> </w:t>
+      </w:r>
+      <w:r>
+        <w:t xml:space="preserve">Eight documented cases (Appendix C), in three groups. A numerical bug: the first AP implementation returned 0.0099 instead of 0, caught by a hand-calculated test. Environment assumptions that only broke on my Windows laptop: a Linux-only module, how Windows starts worker processes, and which Python versions PyTorch and scikit-image actually support. The Python one cost me most of an evening — install, fail, install 3.12, rebuild the environment, wait for 2.5 GB of PyTorch again. And slips in the analysis that turned up when reviewing results: a roofline plot that mixed GPU timings with a CPU ceiling, a</w:t>
       </w:r>
       <w:r>
         <w:t xml:space="preserve"> </w:t>
@@ -5847,7 +5868,7 @@
         <w:t xml:space="preserve"> </w:t>
       </w:r>
       <w:r>
-        <w:t xml:space="preserve">timing that was really serial, over-optimistic run-time estimates). Each was fixed and, where possible, turned into a test.</w:t>
+        <w:t xml:space="preserve">timing that was really serial, and run-time estimates that were far too optimistic. Each was fixed and, where possible, turned into a test.</w:t>
       </w:r>
     </w:p>
     <w:p>
@@ -5855,7 +5876,7 @@
         <w:pStyle w:val="BodyText"/>
       </w:pPr>
       <w:r>
-        <w:t xml:space="preserve">The most valuable AI contribution was not code generation but the</w:t>
+        <w:t xml:space="preserve">The most useful thing it did wasn’t writing code. It was the</w:t>
       </w:r>
       <w:r>
         <w:t xml:space="preserve"> </w:t>
@@ -5868,7 +5889,7 @@
         <w:t xml:space="preserve">data audit</w:t>
       </w:r>
       <w:r>
-        <w:t xml:space="preserve">: it noticed from the file names that the images are video frames and quantified the leakage of the predefined split, which I would not have checked.</w:t>
+        <w:t xml:space="preserve">: it noticed from the file names that the images were video frames and measured how badly the predefined split leaks — something I wouldn’t have thought to check.</w:t>
       </w:r>
     </w:p>
     <w:p>
@@ -5880,13 +5901,13 @@
           <w:bCs/>
           <w:b/>
         </w:rPr>
-        <w:t xml:space="preserve">How the work was verified.</w:t>
-      </w:r>
-      <w:r>
-        <w:t xml:space="preserve"> </w:t>
-      </w:r>
-      <w:r>
-        <w:t xml:space="preserve">(i) Metric code tested against cases worked out by hand and against scikit-learn; (ii) detection metrics cross-checked against the independent Ultralytics validator; (iii) the full pipeline run on synthetic data with exact labels; (iv) a FLOP counter checked by hand calculation and against</w:t>
+        <w:t xml:space="preserve">How the work was checked.</w:t>
+      </w:r>
+      <w:r>
+        <w:t xml:space="preserve"> </w:t>
+      </w:r>
+      <w:r>
+        <w:t xml:space="preserve">(i) Metric code tested against hand-worked cases and scikit-learn; (ii) detection metrics cross-checked against the independent Ultralytics validator; (iii) the full pipeline run on synthetic data with exact labels; (iv) the FLOP counter checked by hand and against</w:t>
       </w:r>
       <w:r>
         <w:t xml:space="preserve"> </w:t>
@@ -5898,7 +5919,7 @@
         <w:t xml:space="preserve">thop</w:t>
       </w:r>
       <w:r>
-        <w:t xml:space="preserve">; (v) figures and error galleries inspected visually; (vi) results reproduced on two machines (cloud CPU, laptop GPU).</w:t>
+        <w:t xml:space="preserve">; (v) figures and error galleries inspected by eye; (vi) results reproduced on two machines (cloud CPU, laptop GPU).</w:t>
       </w:r>
     </w:p>
     <w:p>
@@ -5910,13 +5931,13 @@
           <w:bCs/>
           <w:b/>
         </w:rPr>
-        <w:t xml:space="preserve">Evaluation.</w:t>
-      </w:r>
-      <w:r>
-        <w:t xml:space="preserve"> </w:t>
-      </w:r>
-      <w:r>
-        <w:t xml:space="preserve">AI made it possible to complete a broader and more rigorous project than I could have done alone in the time, and it was consistently strongest at structure, testing discipline and spotting validation problems. Its weaknesses were environment-specific assumptions (operating system, Python versions, hardware) and overconfident estimates — exactly the things that only fail when code meets a real machine. The main risk for me is understanding: code I did not write is code I must be able to explain. To address this, before the presentation I am working through the parts most likely to be questioned — the AP calculation (Section 5.2), the YOLO loss terms and early stopping (Section 3.2), the block split (Section 2.2) and the roofline argument (Section 6) — until I can explain them without notes.</w:t>
+        <w:t xml:space="preserve">Verdict.</w:t>
+      </w:r>
+      <w:r>
+        <w:t xml:space="preserve"> </w:t>
+      </w:r>
+      <w:r>
+        <w:t xml:space="preserve">With AI I finished a broader and more rigorous project than I could have managed alone in the time. It was strongest at structure, testing discipline and spotting validation problems. Its weak spots were assumptions about the environment (operating system, Python version, hardware) and over-confident estimates — exactly the things that only fail when code meets a real machine. The real risk for me is understanding: code I didn’t write is code I still have to be able to explain. So before the presentation I’m working through the parts most likely to be questioned — the AP calculation (Section 5.2), the YOLO loss terms and early stopping (Section 3.2), the block split (Section 2.2) and the roofline argument (Section 6) — until I can explain them without notes.</w:t>
       </w:r>
       <w:r>
         <w:t xml:space="preserve"> </w:t>
@@ -5932,7 +5953,7 @@
         <w:t xml:space="preserve"> </w:t>
       </w:r>
       <w:r>
-        <w:t xml:space="preserve">If I did the project again I would keep a dated log of prompts and decisions from the start rather than reconstructing it afterwards, and I would run the pipeline on the target operating system from the first day.</w:t>
+        <w:t xml:space="preserve">If I did it again, I’d keep a dated log of prompts and decisions from day one instead of reconstructing it afterwards, and I’d run the pipeline on my own laptop from the start rather than at the end.</w:t>
       </w:r>
     </w:p>
     <w:bookmarkEnd w:id="61"/>
@@ -6508,7 +6529,7 @@
         <w:t xml:space="preserve">tests/test_metrics.py</w:t>
       </w:r>
       <w:r>
-        <w:t xml:space="preserve">, 21 tests). IoU for identical, half-overlapping (1/3), contained, touching and degenerate boxes; AP against a three-prediction case worked out on paper (TP, FP, TP with 2 ground-truth boxes → 0.5·1 + 0.5·⅔ = 0.833); ROC AUC against scikit-learn including ties; duplicate detections counted as false positives; IoU-threshold dependence. The first COCO-style AP returned 0.0099 instead of 0 for a detector that never matches (a sentinel point leaked into the 101-point interpolation); the test exposed it. The tests also showed that Ultralytics’ trapezoidal AP is capped at 0.995 for a perfect detector, part of the small gap to our numbers.</w:t>
+        <w:t xml:space="preserve">, 21 tests). IoU for identical, half-overlapping (1/3), contained, touching and degenerate boxes; AP against a three-prediction case worked out on paper (TP, FP, TP with 2 ground-truth boxes → 0.5·1 + 0.5·⅔ = 0.833); ROC AUC against scikit-learn, ties included; duplicate detections counted as false positives; IoU-threshold dependence. The first COCO-style AP returned 0.0099 instead of 0 for a detector that never matches — a sentinel point had leaked into the 101-point interpolation — and the test caught it. The tests also showed that Ultralytics’ trapezoidal AP tops out at 0.995 for a perfect detector, which accounts for part of the small gap to my numbers.</w:t>
       </w:r>
     </w:p>
     <w:p>
@@ -6530,7 +6551,7 @@
         <w:t xml:space="preserve"> </w:t>
       </w:r>
       <w:r>
-        <w:t xml:space="preserve">(test split, mAP@0.5): pretrained 0.5467 (ours, COCO rule) / 0.5470 (ours, trapezoid rule) / 0.5420 (Ultralytics) on the block split; 0.3437 / 0.3456 / 0.3378 on the predefined split; scratch 0.2698 / 0.2711 / 0.2629 and 0.2412 / 0.2429 / 0.2561; synthetic 0.978 vs 0.972. Differences come from interpolation details and from classes with 1–4 boxes.</w:t>
+        <w:t xml:space="preserve">(test split, mAP@0.5): pretrained 0.5467 (mine, COCO rule) / 0.5470 (mine, trapezoid rule) / 0.5420 (Ultralytics) on the block split; 0.3437 / 0.3456 / 0.3378 on the predefined split; scratch 0.2698 / 0.2711 / 0.2629 and 0.2412 / 0.2429 / 0.2561; synthetic 0.978 vs 0.972. The differences come from interpolation details and from classes with 1–4 boxes.</w:t>
       </w:r>
     </w:p>
     <w:p>
@@ -6552,7 +6573,7 @@
         <w:t xml:space="preserve"> </w:t>
       </w:r>
       <w:r>
-        <w:t xml:space="preserve">Boxes read back from YOLO files equal the rendered boxes to &lt; 0.01 px; YOLO→COCO→load gives identical annotations; a training image planted in the test split is flagged by the dHash leakage check (Hamming distance 0).</w:t>
+        <w:t xml:space="preserve">Boxes read back from YOLO files match the rendered boxes to &lt; 0.01 px; YOLO → COCO → load gives identical annotations; a training image planted in the test split is caught by the dHash leakage check (Hamming distance 0).</w:t>
       </w:r>
     </w:p>
     <w:p>
@@ -6605,7 +6626,7 @@
         <w:t xml:space="preserve">tests/test_io.py</w:t>
       </w:r>
       <w:r>
-        <w:t xml:space="preserve">): greyscale, identical channels, too small, under-/over-exposed, clipped, wrong dtype/shape, empty, missing and corrupt files are all rejected with a reason; an end-to-end inspection of {good image, greyscale image, corrupt file} returns {FAIL/PASS, UNSUPPORTED, UNSUPPORTED}.</w:t>
+        <w:t xml:space="preserve">): greyscale, identical channels, too small, under-/over-exposed, clipped, wrong dtype or shape, empty, missing and corrupt files are all rejected with a reason; inspecting {good image, greyscale image, corrupt file} end to end returns {FAIL/PASS, UNSUPPORTED, UNSUPPORTED}.</w:t>
       </w:r>
     </w:p>
     <w:p>
@@ -6627,7 +6648,7 @@
         <w:t xml:space="preserve"> </w:t>
       </w:r>
       <w:r>
-        <w:t xml:space="preserve">The evaluable-class mAP@0.5 of the GPU-trained models re-computed on the cloud CPU matches the laptop exactly (0.783 block, 0.589 predefined).</w:t>
+        <w:t xml:space="preserve">The evaluable-class mAP@0.5 of the GPU-trained models, recomputed on the cloud CPU, matches the laptop exactly (0.783 block, 0.589 predefined).</w:t>
       </w:r>
     </w:p>
     <w:p>
@@ -6709,7 +6730,7 @@
         <w:t xml:space="preserve"> </w:t>
       </w:r>
       <w:r>
-        <w:t xml:space="preserve">on the reference feature extractor showed four functions taking 64 % of the time: colour conversion to Lab (computed three times), white and black top-hats with a 5-px disc, and the orientation statistics. The optimised version computes each colour conversion once and reuses it, uses a 3-px disc (top-hat cost scales with the disc area) and quantises the GLCM to 32 grey levels (256² → 32² matrix). Result:</w:t>
+        <w:t xml:space="preserve">on the reference feature extractor showed four functions taking 64 % of the time: conversion to Lab (done three times), white and black top-hats with a 5-px disc, and the orientation statistics. The optimised version converts each colour space once and reuses it, uses a 3-px disc (top-hat cost scales with disc area) and quantises the GLCM to 32 grey levels (a 256² matrix becomes 32²). Result:</w:t>
       </w:r>
       <w:r>
         <w:t xml:space="preserve"> </w:t>
@@ -6722,7 +6743,7 @@
         <w:t xml:space="preserve">409 → 214 ms per image (1.9×)</w:t>
       </w:r>
       <w:r>
-        <w:t xml:space="preserve">; on the cloud CPU the same change gave 229 → 124 ms (1.85×), so the gain is reproducible across machines. A unit test checks that every feature not deliberately changed is bit-identical between the two versions. Parallelising over images with two processes gave a further 1.6× on Linux; on Windows it falls back to serial (process start-up re-imports the script), which the timing output now flags explicitly.</w:t>
+        <w:t xml:space="preserve">; on the cloud CPU the same change gave 229 → 124 ms (1.85×), so the gain holds across machines. A unit test checks that every feature not deliberately changed is bit-identical between the two versions. Splitting images over two processes gave another 1.6× on Linux; on Windows it falls back to serial (starting a worker re-imports the script), and the timing output now says so.</w:t>
       </w:r>
     </w:p>
     <w:tbl>
@@ -6982,7 +7003,7 @@
         <w:pStyle w:val="BodyText"/>
       </w:pPr>
       <w:r>
-        <w:t xml:space="preserve">Hardware micro-benchmarks on the laptop (final run): 274 GFLOP/s (1024² float32 matrix multiply), 17.4 GB/s (NumPy single-thread copy), 19.3 GB/s (PyTorch multi-thread copy). CPU inference vs threads at 416 px: 1 thread 55 ms, 2 threads 101 ms, 4 threads 60 ms, 14 threads 66 ms. GPU throughput vs batch: 25, 42, 57, 94 images/s at batch 1, 4, 8, 16.</w:t>
+        <w:t xml:space="preserve">Hardware micro-benchmarks on the laptop (final run): 274 GFLOP/s (1024² float32 matrix multiply), 17.4 GB/s (NumPy single-thread copy), 19.3 GB/s (PyTorch multi-thread copy). CPU inference against thread count at 416 px: 1 thread 55 ms, 2 threads 101 ms, 4 threads 60 ms, 14 threads 66 ms. GPU throughput against batch size: 25, 42, 57, 94 images/s at batch 1, 4, 8, 16.</w:t>
       </w:r>
     </w:p>
     <w:p>
@@ -7162,7 +7183,7 @@
               <w:t xml:space="preserve">resource</w:t>
             </w:r>
             <w:r>
-              <w:t xml:space="preserve">, which exists only on Linux/macOS</w:t>
+              <w:t xml:space="preserve">, which only exists on Linux/macOS</w:t>
             </w:r>
           </w:p>
         </w:tc>
@@ -7185,18 +7206,18 @@
               <w:pStyle w:val="Compact"/>
               <w:jc w:val="left"/>
             </w:pPr>
+            <w:r>
+              <w:t xml:space="preserve">switched to</w:t>
+            </w:r>
+            <w:r>
+              <w:t xml:space="preserve"> </w:t>
+            </w:r>
             <w:r>
               <w:rPr>
                 <w:rStyle w:val="VerbatimChar"/>
               </w:rPr>
               <w:t xml:space="preserve">psutil</w:t>
             </w:r>
-            <w:r>
-              <w:t xml:space="preserve"> </w:t>
-            </w:r>
-            <w:r>
-              <w:t xml:space="preserve">used instead</w:t>
-            </w:r>
           </w:p>
         </w:tc>
       </w:tr>
@@ -7221,7 +7242,7 @@
               <w:jc w:val="left"/>
             </w:pPr>
             <w:r>
-              <w:t xml:space="preserve">anticipated after reading the multiprocessing docs; confirmed by the laptop logs</w:t>
+              <w:t xml:space="preserve">expected from the multiprocessing docs; confirmed in the laptop logs</w:t>
             </w:r>
           </w:p>
         </w:tc>
@@ -7247,7 +7268,7 @@
               <w:jc w:val="left"/>
             </w:pPr>
             <w:r>
-              <w:t xml:space="preserve">Set-up script assumed a Python version supported by PyTorch and scikit-image; my default Python 3.15 had no scikit-image build</w:t>
+              <w:t xml:space="preserve">Set-up script assumed a Python version that PyTorch and scikit-image support; my default Python 3.15 had no scikit-image build</w:t>
             </w:r>
           </w:p>
         </w:tc>
@@ -7271,7 +7292,7 @@
               <w:jc w:val="left"/>
             </w:pPr>
             <w:r>
-              <w:t xml:space="preserve">script selects Python 3.10–3.13 via the</w:t>
+              <w:t xml:space="preserve">script now picks Python 3.10–3.13 via the</w:t>
             </w:r>
             <w:r>
               <w:t xml:space="preserve"> </w:t>
@@ -7286,7 +7307,7 @@
               <w:t xml:space="preserve"> </w:t>
             </w:r>
             <w:r>
-              <w:t xml:space="preserve">launcher</w:t>
+              <w:t xml:space="preserve">launcher; I installed 3.12</w:t>
             </w:r>
           </w:p>
         </w:tc>
@@ -7300,7 +7321,7 @@
               <w:jc w:val="left"/>
             </w:pPr>
             <w:r>
-              <w:t xml:space="preserve">Roofline compared GPU timings with a CPU compute ceiling (two different machines in one plot)</w:t>
+              <w:t xml:space="preserve">Roofline compared GPU timings with a CPU compute ceiling (two machines in one plot)</w:t>
             </w:r>
           </w:p>
         </w:tc>
@@ -7350,7 +7371,7 @@
               <w:t xml:space="preserve"> </w:t>
             </w:r>
             <w:r>
-              <w:t xml:space="preserve">feature-extraction timing on Windows was actually a second serial run</w:t>
+              <w:t xml:space="preserve">feature-extraction timing on Windows was really a second serial run</w:t>
             </w:r>
           </w:p>
         </w:tc>
@@ -7388,19 +7409,19 @@
               <w:jc w:val="left"/>
             </w:pPr>
             <w:r>
-              <w:t xml:space="preserve">The synthetic tray images were designed before the real images were seen and look quite different</w:t>
-            </w:r>
-          </w:p>
-        </w:tc>
-        <w:tc>
-          <w:tcPr/>
-          <w:p>
-            <w:pPr>
-              <w:pStyle w:val="Compact"/>
-              <w:jc w:val="left"/>
-            </w:pPr>
-            <w:r>
-              <w:t xml:space="preserve">visual comparison with the dataset</w:t>
+              <w:t xml:space="preserve">The synthetic trays were designed before the real images had been seen and look quite different</w:t>
+            </w:r>
+          </w:p>
+        </w:tc>
+        <w:tc>
+          <w:tcPr/>
+          <w:p>
+            <w:pPr>
+              <w:pStyle w:val="Compact"/>
+              <w:jc w:val="left"/>
+            </w:pPr>
+            <w:r>
+              <w:t xml:space="preserve">compared by eye with the dataset</w:t>
             </w:r>
           </w:p>
         </w:tc>
@@ -7426,7 +7447,7 @@
               <w:jc w:val="left"/>
             </w:pPr>
             <w:r>
-              <w:t xml:space="preserve">Several time estimates were wrong (e.g. </w:t>
+              <w:t xml:space="preserve">Several time estimates were badly wrong (e.g. </w:t>
             </w:r>
             <w:r>
               <w:t xml:space="preserve">“</w:t>
@@ -7453,7 +7474,7 @@
               <w:jc w:val="left"/>
             </w:pPr>
             <w:r>
-              <w:t xml:space="preserve">observation</w:t>
+              <w:t xml:space="preserve">watching the runs</w:t>
             </w:r>
           </w:p>
         </w:tc>

</xml_diff>

<commit_message>
Add GitHub repository link
Co-Authored-By: Claude Opus 5.5 <noreply@anthropic.com>
</commit_message>
<xml_diff>
--- a/docs/REPORT.docx
+++ b/docs/REPORT.docx
@@ -2,7 +2,7 @@
 <file path=word/document.xml><?xml version="1.0" encoding="utf-8"?>
 <w:document xmlns:w="http://schemas.openxmlformats.org/wordprocessingml/2006/main" xmlns:m="http://schemas.openxmlformats.org/officeDocument/2006/math" xmlns:r="http://schemas.openxmlformats.org/officeDocument/2006/relationships" xmlns:o="urn:schemas-microsoft-com:office:office" xmlns:v="urn:schemas-microsoft-com:vml" xmlns:w10="urn:schemas-microsoft-com:office:word" xmlns:a="http://schemas.openxmlformats.org/drawingml/2006/main" xmlns:pic="http://schemas.openxmlformats.org/drawingml/2006/picture" xmlns:wp="http://schemas.openxmlformats.org/drawingml/2006/wordprocessingDrawing">
   <w:body>
-    <w:bookmarkStart w:id="72" w:name="Xdd683d8916658f38d8a768c53356210063506a2"/>
+    <w:bookmarkStart w:id="73" w:name="Xdd683d8916658f38d8a768c53356210063506a2"/>
     <w:p>
       <w:pPr>
         <w:pStyle w:val="Heading1"/>
@@ -31,12 +31,14 @@
       <w:r>
         <w:t xml:space="preserve"> </w:t>
       </w:r>
-      <w:r>
-        <w:rPr>
-          <w:rStyle w:val="VerbatimChar"/>
-        </w:rPr>
-        <w:t xml:space="preserve">rasher-qc</w:t>
-      </w:r>
+      <w:hyperlink r:id="rId20">
+        <w:r>
+          <w:rPr>
+            <w:rStyle w:val="Hyperlink"/>
+          </w:rPr>
+          <w:t xml:space="preserve">github.com/Lytena/rasher-qc</w:t>
+        </w:r>
+      </w:hyperlink>
       <w:r>
         <w:t xml:space="preserve"> </w:t>
       </w:r>
@@ -140,7 +142,7 @@
         </w:pict>
       </w:r>
     </w:p>
-    <w:bookmarkStart w:id="20" w:name="engineering-problem"/>
+    <w:bookmarkStart w:id="21" w:name="engineering-problem"/>
     <w:p>
       <w:pPr>
         <w:pStyle w:val="Heading2"/>
@@ -398,8 +400,8 @@
         <w:t xml:space="preserve">Only the five labelled defects and this dataset’s camera set-up (fixed overhead camera, dark textured belt, clear trays, 720 × 540 images). No seal-strength or leak testing — a seal can look fine and still leak — no weight or slice counts, no hardware integration, and no claims about other products, trays or lighting.</w:t>
       </w:r>
     </w:p>
-    <w:bookmarkEnd w:id="20"/>
-    <w:bookmarkStart w:id="27" w:name="inputs-outputs-and-data"/>
+    <w:bookmarkEnd w:id="21"/>
+    <w:bookmarkStart w:id="28" w:name="inputs-outputs-and-data"/>
     <w:p>
       <w:pPr>
         <w:pStyle w:val="Heading2"/>
@@ -408,7 +410,7 @@
         <w:t xml:space="preserve">2. Inputs, outputs and data</w:t>
       </w:r>
     </w:p>
-    <w:bookmarkStart w:id="21" w:name="top-level-inputs-and-outputs"/>
+    <w:bookmarkStart w:id="22" w:name="top-level-inputs-and-outputs"/>
     <w:p>
       <w:pPr>
         <w:pStyle w:val="Heading3"/>
@@ -924,8 +926,8 @@
         <w:t xml:space="preserve">).</w:t>
       </w:r>
     </w:p>
-    <w:bookmarkEnd w:id="21"/>
-    <w:bookmarkStart w:id="25" w:name="the-dataset-and-what-the-audit-turned-up"/>
+    <w:bookmarkEnd w:id="22"/>
+    <w:bookmarkStart w:id="26" w:name="the-dataset-and-what-the-audit-turned-up"/>
     <w:p>
       <w:pPr>
         <w:pStyle w:val="Heading3"/>
@@ -1406,18 +1408,18 @@
           <wp:inline>
             <wp:extent cx="5334000" cy="846666"/>
             <wp:effectExtent b="0" l="0" r="0" t="0"/>
-            <wp:docPr descr="Examples of each class (training split)" title="" id="23" name="Picture"/>
+            <wp:docPr descr="Examples of each class (training split)" title="" id="24" name="Picture"/>
             <a:graphic>
               <a:graphicData uri="http://schemas.openxmlformats.org/drawingml/2006/picture">
                 <pic:pic>
                   <pic:nvPicPr>
-                    <pic:cNvPr descr="../results/pork-rasher/figures/examples.png" id="24" name="Picture"/>
+                    <pic:cNvPr descr="../results/pork-rasher/figures/examples.png" id="25" name="Picture"/>
                     <pic:cNvPicPr>
                       <a:picLocks noChangeArrowheads="1" noChangeAspect="1"/>
                     </pic:cNvPicPr>
                   </pic:nvPicPr>
                   <pic:blipFill>
-                    <a:blip r:embed="rId22"/>
+                    <a:blip r:embed="rId23"/>
                     <a:stretch>
                       <a:fillRect/>
                     </a:stretch>
@@ -1452,8 +1454,8 @@
         <w:t xml:space="preserve">Examples of each class (training split)</w:t>
       </w:r>
     </w:p>
-    <w:bookmarkEnd w:id="25"/>
-    <w:bookmarkStart w:id="26" w:name="synthetic-verification-dataset"/>
+    <w:bookmarkEnd w:id="26"/>
+    <w:bookmarkStart w:id="27" w:name="synthetic-verification-dataset"/>
     <w:p>
       <w:pPr>
         <w:pStyle w:val="Heading3"/>
@@ -1492,9 +1494,9 @@
         <w:t xml:space="preserve">. It does the job a manufactured solution does in numerical methods: if the pipeline can’t score perfect labels perfectly, the bug is in my code, not in the data. It also lets me vary one thing at a time, like defect size or glare. It tells me nothing about real trays, though, and the real scenes (clear trays half in view on a dark textured belt) look quite different from what I generated. So it is used for verification only.</w:t>
       </w:r>
     </w:p>
-    <w:bookmarkEnd w:id="26"/>
     <w:bookmarkEnd w:id="27"/>
-    <w:bookmarkStart w:id="32" w:name="computational-solution"/>
+    <w:bookmarkEnd w:id="28"/>
+    <w:bookmarkStart w:id="33" w:name="computational-solution"/>
     <w:p>
       <w:pPr>
         <w:pStyle w:val="Heading2"/>
@@ -1503,7 +1505,7 @@
         <w:t xml:space="preserve">3. Computational solution</w:t>
       </w:r>
     </w:p>
-    <w:bookmarkStart w:id="28" w:name="pipeline"/>
+    <w:bookmarkStart w:id="29" w:name="pipeline"/>
     <w:p>
       <w:pPr>
         <w:pStyle w:val="Heading3"/>
@@ -1523,8 +1525,8 @@
         <w:t xml:space="preserve">image → validation (io) → YOLOv8n detector → per-class boxes + confidences → tray score s = max defect confidence → decision (PASS / REVIEW / FAIL) → report</w:t>
       </w:r>
     </w:p>
-    <w:bookmarkEnd w:id="28"/>
-    <w:bookmarkStart w:id="29" w:name="X6e5a514276f75270dcee12109984b4f4df9326f"/>
+    <w:bookmarkEnd w:id="29"/>
+    <w:bookmarkStart w:id="30" w:name="X6e5a514276f75270dcee12109984b4f4df9326f"/>
     <w:p>
       <w:pPr>
         <w:pStyle w:val="Heading3"/>
@@ -1815,8 +1817,8 @@
         <w:t xml:space="preserve">wraps Ultralytics 8.4. One trap worth mentioning: Ultralytics expects OpenCV’s BGR channel order, while everything else in my code is RGB. Get it wrong and nothing crashes; red meat just quietly turns blue. A unit test checks that passing an image as an array or as a file gives identical detections.</w:t>
       </w:r>
     </w:p>
-    <w:bookmarkEnd w:id="29"/>
-    <w:bookmarkStart w:id="30" w:name="tray-decision"/>
+    <w:bookmarkEnd w:id="30"/>
+    <w:bookmarkStart w:id="31" w:name="tray-decision"/>
     <w:p>
       <w:pPr>
         <w:pStyle w:val="Heading3"/>
@@ -2028,8 +2030,8 @@
         <w:t xml:space="preserve">is the highest that catches at least 99 %, and anything in between goes to a person. Those targets encode the lopsided costs from Section 1. They’re engineering choices a plant would set for itself, not results.</w:t>
       </w:r>
     </w:p>
-    <w:bookmarkEnd w:id="30"/>
-    <w:bookmarkStart w:id="31" w:name="known-limitations-of-the-method"/>
+    <w:bookmarkEnd w:id="31"/>
+    <w:bookmarkStart w:id="32" w:name="known-limitations-of-the-method"/>
     <w:p>
       <w:pPr>
         <w:pStyle w:val="Heading3"/>
@@ -2101,9 +2103,9 @@
         <w:t xml:space="preserve">Ultralytics is AGPL-3.0. A closed-source commercial version would need a commercial licence or a different detector.</w:t>
       </w:r>
     </w:p>
-    <w:bookmarkEnd w:id="31"/>
     <w:bookmarkEnd w:id="32"/>
-    <w:bookmarkStart w:id="39" w:name="alternative-solutions"/>
+    <w:bookmarkEnd w:id="33"/>
+    <w:bookmarkStart w:id="40" w:name="alternative-solutions"/>
     <w:p>
       <w:pPr>
         <w:pStyle w:val="Heading2"/>
@@ -3083,18 +3085,18 @@
           <wp:inline>
             <wp:extent cx="2613660" cy="2474975"/>
             <wp:effectExtent b="0" l="0" r="0" t="0"/>
-            <wp:docPr descr="Tray ROC (block split)" title="" id="34" name="Picture"/>
+            <wp:docPr descr="Tray ROC (block split)" title="" id="35" name="Picture"/>
             <a:graphic>
               <a:graphicData uri="http://schemas.openxmlformats.org/drawingml/2006/picture">
                 <pic:pic>
                   <pic:nvPicPr>
-                    <pic:cNvPr descr="../results/pork-rasher-block/figures/tray_roc.png" id="35" name="Picture"/>
+                    <pic:cNvPr descr="../results/pork-rasher-block/figures/tray_roc.png" id="36" name="Picture"/>
                     <pic:cNvPicPr>
                       <a:picLocks noChangeArrowheads="1" noChangeAspect="1"/>
                     </pic:cNvPicPr>
                   </pic:nvPicPr>
                   <pic:blipFill>
-                    <a:blip r:embed="rId33"/>
+                    <a:blip r:embed="rId34"/>
                     <a:stretch>
                       <a:fillRect/>
                     </a:stretch>
@@ -3128,18 +3130,18 @@
           <wp:inline>
             <wp:extent cx="2613660" cy="1949533"/>
             <wp:effectExtent b="0" l="0" r="0" t="0"/>
-            <wp:docPr descr="Operating points (block split)" title="" id="37" name="Picture"/>
+            <wp:docPr descr="Operating points (block split)" title="" id="38" name="Picture"/>
             <a:graphic>
               <a:graphicData uri="http://schemas.openxmlformats.org/drawingml/2006/picture">
                 <pic:pic>
                   <pic:nvPicPr>
-                    <pic:cNvPr descr="../results/pork-rasher-block/figures/operating_points.png" id="38" name="Picture"/>
+                    <pic:cNvPr descr="../results/pork-rasher-block/figures/operating_points.png" id="39" name="Picture"/>
                     <pic:cNvPicPr>
                       <a:picLocks noChangeArrowheads="1" noChangeAspect="1"/>
                     </pic:cNvPicPr>
                   </pic:nvPicPr>
                   <pic:blipFill>
-                    <a:blip r:embed="rId36"/>
+                    <a:blip r:embed="rId37"/>
                     <a:stretch>
                       <a:fillRect/>
                     </a:stretch>
@@ -3268,8 +3270,8 @@
         <w:t xml:space="preserve">at the film edge that nobody labelled.</w:t>
       </w:r>
     </w:p>
-    <w:bookmarkEnd w:id="39"/>
-    <w:bookmarkStart w:id="48" w:name="validation"/>
+    <w:bookmarkEnd w:id="40"/>
+    <w:bookmarkStart w:id="49" w:name="validation"/>
     <w:p>
       <w:pPr>
         <w:pStyle w:val="Heading2"/>
@@ -3278,7 +3280,7 @@
         <w:t xml:space="preserve">5. Validation</w:t>
       </w:r>
     </w:p>
-    <w:bookmarkStart w:id="40" w:name="what-is-validated-and-how"/>
+    <w:bookmarkStart w:id="41" w:name="what-is-validated-and-how"/>
     <w:p>
       <w:pPr>
         <w:pStyle w:val="Heading3"/>
@@ -3581,8 +3583,8 @@
         <w:t xml:space="preserve">validation data picked the best epoch and the thresholds, and cross-validation on training data picked the baseline’s hyper-parameters. The test split was touched once, after all of that.</w:t>
       </w:r>
     </w:p>
-    <w:bookmarkEnd w:id="40"/>
-    <w:bookmarkStart w:id="41" w:name="verification-of-the-implementation"/>
+    <w:bookmarkEnd w:id="41"/>
+    <w:bookmarkStart w:id="42" w:name="verification-of-the-implementation"/>
     <w:p>
       <w:pPr>
         <w:pStyle w:val="Heading3"/>
@@ -3704,8 +3706,8 @@
         <w:t xml:space="preserve">), on Linux and on Windows.</w:t>
       </w:r>
     </w:p>
-    <w:bookmarkEnd w:id="41"/>
-    <w:bookmarkStart w:id="45" w:name="results-on-the-real-data"/>
+    <w:bookmarkEnd w:id="42"/>
+    <w:bookmarkStart w:id="46" w:name="results-on-the-real-data"/>
     <w:p>
       <w:pPr>
         <w:pStyle w:val="Heading3"/>
@@ -3833,18 +3835,18 @@
           <wp:inline>
             <wp:extent cx="4267200" cy="3734316"/>
             <wp:effectExtent b="0" l="0" r="0" t="0"/>
-            <wp:docPr descr="Error gallery (block split, pretrained detector)" title="" id="43" name="Picture"/>
+            <wp:docPr descr="Error gallery (block split, pretrained detector)" title="" id="44" name="Picture"/>
             <a:graphic>
               <a:graphicData uri="http://schemas.openxmlformats.org/drawingml/2006/picture">
                 <pic:pic>
                   <pic:nvPicPr>
-                    <pic:cNvPr descr="../results/pork-rasher-block/figures/error_gallery.png" id="44" name="Picture"/>
+                    <pic:cNvPr descr="../results/pork-rasher-block/figures/error_gallery.png" id="45" name="Picture"/>
                     <pic:cNvPicPr>
                       <a:picLocks noChangeArrowheads="1" noChangeAspect="1"/>
                     </pic:cNvPicPr>
                   </pic:nvPicPr>
                   <pic:blipFill>
-                    <a:blip r:embed="rId42"/>
+                    <a:blip r:embed="rId43"/>
                     <a:stretch>
                       <a:fillRect/>
                     </a:stretch>
@@ -3988,8 +3990,8 @@
         <w:t xml:space="preserve">. Each tray appears in several consecutive frames, and the decision should be made once per tray, using all of them (Section 7).</w:t>
       </w:r>
     </w:p>
-    <w:bookmarkEnd w:id="45"/>
-    <w:bookmarkStart w:id="46" w:name="how-optimistic-is-the-predefined-split"/>
+    <w:bookmarkEnd w:id="46"/>
+    <w:bookmarkStart w:id="47" w:name="how-optimistic-is-the-predefined-split"/>
     <w:p>
       <w:pPr>
         <w:pStyle w:val="Heading3"/>
@@ -4291,8 +4293,8 @@
         <w:t xml:space="preserve">, because it has too few good trays and those it does have are near-copies of training frames. The block split, with three times as many good trays from unseen stretches of video, is the number an engineer should use.</w:t>
       </w:r>
     </w:p>
-    <w:bookmarkEnd w:id="46"/>
-    <w:bookmarkStart w:id="47" w:name="what-the-validation-cannot-establish"/>
+    <w:bookmarkEnd w:id="47"/>
+    <w:bookmarkStart w:id="48" w:name="what-the-validation-cannot-establish"/>
     <w:p>
       <w:pPr>
         <w:pStyle w:val="Heading3"/>
@@ -4445,9 +4447,9 @@
         <w:t xml:space="preserve">Whether the seal actually holds. The system only knows what the camera sees.</w:t>
       </w:r>
     </w:p>
-    <w:bookmarkEnd w:id="47"/>
     <w:bookmarkEnd w:id="48"/>
-    <w:bookmarkStart w:id="59" w:name="optimisation-and-performance"/>
+    <w:bookmarkEnd w:id="49"/>
+    <w:bookmarkStart w:id="60" w:name="optimisation-and-performance"/>
     <w:p>
       <w:pPr>
         <w:pStyle w:val="Heading2"/>
@@ -4456,7 +4458,7 @@
         <w:t xml:space="preserve">6. Optimisation and performance</w:t>
       </w:r>
     </w:p>
-    <w:bookmarkStart w:id="49" w:name="is-it-fast-enough"/>
+    <w:bookmarkStart w:id="50" w:name="is-it-fast-enough"/>
     <w:p>
       <w:pPr>
         <w:pStyle w:val="Heading3"/>
@@ -4925,8 +4927,8 @@
         <w:t xml:space="preserve">accurate, most likely because the model was trained at 416 px and objects then appear at a scale it hasn’t seen. The GPU numbers at batch 1 are mostly fixed per-call overhead rather than arithmetic, and they bounced around between runs on my laptop (about 9 ms in the final run, 30–40 ms in an earlier one, presumably a different power state). So I base the requirement on the CPU numbers. Batching does lift GPU throughput from 25 to 94 images per second (batch 1 → 16) — nice for re-checking a day’s footage offline, irrelevant on a line that hands you one tray at a time. Peak memory was 1.8 GB, almost all PyTorch/CUDA runtime; the weights themselves are 6.5 MB.</w:t>
       </w:r>
     </w:p>
-    <w:bookmarkEnd w:id="49"/>
-    <w:bookmarkStart w:id="53" w:name="Xb5efa35d19c4111afafc83ae0a369064be16679"/>
+    <w:bookmarkEnd w:id="50"/>
+    <w:bookmarkStart w:id="54" w:name="Xb5efa35d19c4111afafc83ae0a369064be16679"/>
     <w:p>
       <w:pPr>
         <w:pStyle w:val="Heading3"/>
@@ -5018,18 +5020,18 @@
           <wp:inline>
             <wp:extent cx="2667000" cy="2011474"/>
             <wp:effectExtent b="0" l="0" r="0" t="0"/>
-            <wp:docPr descr="Roofline" title="" id="51" name="Picture"/>
+            <wp:docPr descr="Roofline" title="" id="52" name="Picture"/>
             <a:graphic>
               <a:graphicData uri="http://schemas.openxmlformats.org/drawingml/2006/picture">
                 <pic:pic>
                   <pic:nvPicPr>
-                    <pic:cNvPr descr="../results/pork-rasher-block/figures/roofline.png" id="52" name="Picture"/>
+                    <pic:cNvPr descr="../results/pork-rasher-block/figures/roofline.png" id="53" name="Picture"/>
                     <pic:cNvPicPr>
                       <a:picLocks noChangeArrowheads="1" noChangeAspect="1"/>
                     </pic:cNvPicPr>
                   </pic:nvPicPr>
                   <pic:blipFill>
-                    <a:blip r:embed="rId50"/>
+                    <a:blip r:embed="rId51"/>
                     <a:stretch>
                       <a:fillRect/>
                     </a:stretch>
@@ -5101,8 +5103,8 @@
         <w:t xml:space="preserve">. So the gap isn’t memory bandwidth; it’s how inefficiently a CPU runs lots of small convolutions (short inner loops, data re-layout, thread synchronisation at every layer). The thread-scaling test points the same way: one thread (55 ms) beat fourteen (66 ms) on this hybrid P-/E-core chip. The sensible next steps are about how the operations are executed, not the algorithm: a runtime that fuses layers (ONNX Runtime or OpenVINO), or int8 quantisation (about 4× fewer bytes and faster integer kernels). One cautionary note: the same micro-benchmarks gave 97 GFLOP/s and 4 GB/s in an earlier run on the same laptop. Laptop power management makes any single timing run unreliable, which is why I lean on the 12× margin rather than the third significant figure.</w:t>
       </w:r>
     </w:p>
-    <w:bookmarkEnd w:id="53"/>
-    <w:bookmarkStart w:id="54" w:name="speeding-up-the-baseline-profiling"/>
+    <w:bookmarkEnd w:id="54"/>
+    <w:bookmarkStart w:id="55" w:name="speeding-up-the-baseline-profiling"/>
     <w:p>
       <w:pPr>
         <w:pStyle w:val="Heading3"/>
@@ -5141,8 +5143,8 @@
         <w:t xml:space="preserve">, and the gain reproduced on both machines. A test makes sure every feature I didn’t mean to change stays bit-identical (Appendix B).</w:t>
       </w:r>
     </w:p>
-    <w:bookmarkEnd w:id="54"/>
-    <w:bookmarkStart w:id="58" w:name="sensitivity-and-robustness"/>
+    <w:bookmarkEnd w:id="55"/>
+    <w:bookmarkStart w:id="59" w:name="sensitivity-and-robustness"/>
     <w:p>
       <w:pPr>
         <w:pStyle w:val="Heading3"/>
@@ -5160,18 +5162,18 @@
           <wp:inline>
             <wp:extent cx="4533900" cy="2446197"/>
             <wp:effectExtent b="0" l="0" r="0" t="0"/>
-            <wp:docPr descr="Robustness (block split)" title="" id="56" name="Picture"/>
+            <wp:docPr descr="Robustness (block split)" title="" id="57" name="Picture"/>
             <a:graphic>
               <a:graphicData uri="http://schemas.openxmlformats.org/drawingml/2006/picture">
                 <pic:pic>
                   <pic:nvPicPr>
-                    <pic:cNvPr descr="../results/pork-rasher-block/figures/robustness.png" id="57" name="Picture"/>
+                    <pic:cNvPr descr="../results/pork-rasher-block/figures/robustness.png" id="58" name="Picture"/>
                     <pic:cNvPicPr>
                       <a:picLocks noChangeArrowheads="1" noChangeAspect="1"/>
                     </pic:cNvPicPr>
                   </pic:nvPicPr>
                   <pic:blipFill>
-                    <a:blip r:embed="rId55"/>
+                    <a:blip r:embed="rId56"/>
                     <a:stretch>
                       <a:fillRect/>
                     </a:stretch>
@@ -5348,9 +5350,9 @@
         <w:t xml:space="preserve">instead of being scored.</w:t>
       </w:r>
     </w:p>
-    <w:bookmarkEnd w:id="58"/>
     <w:bookmarkEnd w:id="59"/>
-    <w:bookmarkStart w:id="60" w:name="limitations-and-lessons-learned"/>
+    <w:bookmarkEnd w:id="60"/>
+    <w:bookmarkStart w:id="61" w:name="limitations-and-lessons-learned"/>
     <w:p>
       <w:pPr>
         <w:pStyle w:val="Heading2"/>
@@ -5789,8 +5791,8 @@
         <w:t xml:space="preserve">Export to ONNX/OpenVINO with int8 quantisation, and re-pick the thresholds on site using the plant’s own costs for escapes and re-checks.</w:t>
       </w:r>
     </w:p>
-    <w:bookmarkEnd w:id="60"/>
-    <w:bookmarkStart w:id="61" w:name="reflection-on-the-use-of-ai"/>
+    <w:bookmarkEnd w:id="61"/>
+    <w:bookmarkStart w:id="62" w:name="reflection-on-the-use-of-ai"/>
     <w:p>
       <w:pPr>
         <w:pStyle w:val="Heading2"/>
@@ -5956,8 +5958,8 @@
         <w:t xml:space="preserve">If I did it again, I’d keep a dated log of prompts and decisions from day one instead of reconstructing it afterwards, and I’d run the pipeline on my own laptop from the start rather than at the end.</w:t>
       </w:r>
     </w:p>
-    <w:bookmarkEnd w:id="61"/>
-    <w:bookmarkStart w:id="62" w:name="references"/>
+    <w:bookmarkEnd w:id="62"/>
+    <w:bookmarkStart w:id="63" w:name="references"/>
     <w:p>
       <w:pPr>
         <w:pStyle w:val="Heading2"/>
@@ -6491,8 +6493,8 @@
         </w:pict>
       </w:r>
     </w:p>
-    <w:bookmarkEnd w:id="62"/>
-    <w:bookmarkStart w:id="66" w:name="appendix-a-verification-details"/>
+    <w:bookmarkEnd w:id="63"/>
+    <w:bookmarkStart w:id="67" w:name="appendix-a-verification-details"/>
     <w:p>
       <w:pPr>
         <w:pStyle w:val="Heading2"/>
@@ -6660,18 +6662,18 @@
           <wp:inline>
             <wp:extent cx="2933700" cy="1871330"/>
             <wp:effectExtent b="0" l="0" r="0" t="0"/>
-            <wp:docPr descr="Distance of evaluation frames to the nearest training frame (predefined split)" title="" id="64" name="Picture"/>
+            <wp:docPr descr="Distance of evaluation frames to the nearest training frame (predefined split)" title="" id="65" name="Picture"/>
             <a:graphic>
               <a:graphicData uri="http://schemas.openxmlformats.org/drawingml/2006/picture">
                 <pic:pic>
                   <pic:nvPicPr>
-                    <pic:cNvPr descr="../results/pork-rasher/figures/frame_gaps.png" id="65" name="Picture"/>
+                    <pic:cNvPr descr="../results/pork-rasher/figures/frame_gaps.png" id="66" name="Picture"/>
                     <pic:cNvPicPr>
                       <a:picLocks noChangeArrowheads="1" noChangeAspect="1"/>
                     </pic:cNvPicPr>
                   </pic:nvPicPr>
                   <pic:blipFill>
-                    <a:blip r:embed="rId63"/>
+                    <a:blip r:embed="rId64"/>
                     <a:stretch>
                       <a:fillRect/>
                     </a:stretch>
@@ -6706,8 +6708,8 @@
         <w:t xml:space="preserve">Distance of evaluation frames to the nearest training frame (predefined split)</w:t>
       </w:r>
     </w:p>
-    <w:bookmarkEnd w:id="66"/>
-    <w:bookmarkStart w:id="70" w:name="appendix-b-performance-details"/>
+    <w:bookmarkEnd w:id="67"/>
+    <w:bookmarkStart w:id="71" w:name="appendix-b-performance-details"/>
     <w:p>
       <w:pPr>
         <w:pStyle w:val="Heading2"/>
@@ -7015,18 +7017,18 @@
           <wp:inline>
             <wp:extent cx="2933700" cy="1896171"/>
             <wp:effectExtent b="0" l="0" r="0" t="0"/>
-            <wp:docPr descr="Accuracy-latency trade-off" title="" id="68" name="Picture"/>
+            <wp:docPr descr="Accuracy-latency trade-off" title="" id="69" name="Picture"/>
             <a:graphic>
               <a:graphicData uri="http://schemas.openxmlformats.org/drawingml/2006/picture">
                 <pic:pic>
                   <pic:nvPicPr>
-                    <pic:cNvPr descr="../results/pork-rasher-block/figures/latency_vs_imgsz.png" id="69" name="Picture"/>
+                    <pic:cNvPr descr="../results/pork-rasher-block/figures/latency_vs_imgsz.png" id="70" name="Picture"/>
                     <pic:cNvPicPr>
                       <a:picLocks noChangeArrowheads="1" noChangeAspect="1"/>
                     </pic:cNvPicPr>
                   </pic:nvPicPr>
                   <pic:blipFill>
-                    <a:blip r:embed="rId67"/>
+                    <a:blip r:embed="rId68"/>
                     <a:stretch>
                       <a:fillRect/>
                     </a:stretch>
@@ -7061,8 +7063,8 @@
         <w:t xml:space="preserve">Accuracy-latency trade-off</w:t>
       </w:r>
     </w:p>
-    <w:bookmarkEnd w:id="70"/>
-    <w:bookmarkStart w:id="71" w:name="appendix-c-ai-use-log"/>
+    <w:bookmarkEnd w:id="71"/>
+    <w:bookmarkStart w:id="72" w:name="appendix-c-ai-use-log"/>
     <w:p>
       <w:pPr>
         <w:pStyle w:val="Heading2"/>
@@ -7492,8 +7494,8 @@
         </w:tc>
       </w:tr>
     </w:tbl>
-    <w:bookmarkEnd w:id="71"/>
     <w:bookmarkEnd w:id="72"/>
+    <w:bookmarkEnd w:id="73"/>
     <w:sectPr>
       <w:pgMar w:bottom="1020" w:left="1134" w:right="1134" w:top="1020"/>
     </w:sectPr>

</xml_diff>